<commit_message>
Remove dashes from the assessment report and fill the nonverbal-thinking row of the schema
Co-Authored-By: Claude Fable 5.1 <noreply@anthropic.com>
Claude-Session: https://claude.ai/code/session_011Z9C2ptByc9jQga6MDruQz
</commit_message>
<xml_diff>
--- a/deliverables/דוח_אבחון_סמיר_מושלם.docx
+++ b/deliverables/דוח_אבחון_סמיר_מושלם.docx
@@ -362,11 +362,6 @@
             </w:pPr>
             <w:r>
               <w:rPr>
-                <w:noProof/>
-              </w:rPr>
-            </w:r>
-            <w:r>
-              <w:rPr>
                 <w:rFonts w:ascii="David" w:hAnsi="David" w:cs="David" w:eastAsia="David"/>
                 <w:b w:val="0"/>
                 <w:i w:val="0"/>
@@ -375,7 +370,7 @@
                 <w:szCs w:val="20"/>
                 <w:noProof/>
               </w:rPr>
-              <w:t>—</w:t>
+              <w:t xml:space="preserve">לא נמסר</w:t>
             </w:r>
           </w:p>
         </w:tc>
@@ -1979,11 +1974,6 @@
             </w:pPr>
             <w:r>
               <w:rPr>
-                <w:noProof/>
-              </w:rPr>
-            </w:r>
-            <w:r>
-              <w:rPr>
                 <w:rFonts w:ascii="David" w:hAnsi="David" w:cs="David" w:eastAsia="David"/>
                 <w:b w:val="0"/>
                 <w:i w:val="0"/>
@@ -1992,7 +1982,7 @@
                 <w:szCs w:val="20"/>
                 <w:noProof/>
               </w:rPr>
-              <w:t>גן – ג'</w:t>
+              <w:t xml:space="preserve">גן עד ג'</w:t>
             </w:r>
           </w:p>
         </w:tc>
@@ -2097,11 +2087,6 @@
             </w:pPr>
             <w:r>
               <w:rPr>
-                <w:noProof/>
-              </w:rPr>
-            </w:r>
-            <w:r>
-              <w:rPr>
                 <w:rFonts w:ascii="David" w:hAnsi="David" w:cs="David" w:eastAsia="David"/>
                 <w:b w:val="0"/>
                 <w:i w:val="0"/>
@@ -2110,7 +2095,7 @@
                 <w:szCs w:val="20"/>
                 <w:noProof/>
               </w:rPr>
-              <w:t>—</w:t>
+              <w:t xml:space="preserve"/>
             </w:r>
           </w:p>
         </w:tc>
@@ -2126,11 +2111,6 @@
             </w:pPr>
             <w:r>
               <w:rPr>
-                <w:noProof/>
-              </w:rPr>
-            </w:r>
-            <w:r>
-              <w:rPr>
                 <w:rFonts w:ascii="David" w:hAnsi="David" w:cs="David" w:eastAsia="David"/>
                 <w:b w:val="0"/>
                 <w:i w:val="0"/>
@@ -2139,7 +2119,7 @@
                 <w:szCs w:val="20"/>
                 <w:noProof/>
               </w:rPr>
-              <w:t>—</w:t>
+              <w:t xml:space="preserve"/>
             </w:r>
           </w:p>
         </w:tc>
@@ -2155,11 +2135,6 @@
             </w:pPr>
             <w:r>
               <w:rPr>
-                <w:noProof/>
-              </w:rPr>
-            </w:r>
-            <w:r>
-              <w:rPr>
                 <w:rFonts w:ascii="David" w:hAnsi="David" w:cs="David" w:eastAsia="David"/>
                 <w:b w:val="0"/>
                 <w:i w:val="0"/>
@@ -2168,7 +2143,7 @@
                 <w:szCs w:val="20"/>
                 <w:noProof/>
               </w:rPr>
-              <w:t>—</w:t>
+              <w:t xml:space="preserve"/>
             </w:r>
           </w:p>
         </w:tc>
@@ -2352,7 +2327,7 @@
           <w:szCs w:val="24"/>
           <w:noProof/>
         </w:rPr>
-        <w:t>כלי ההערכה: מבחני "آلية فحص – كراسة مهمات للتلميذ للصفوف الثالثة" (אסדי, שני, בן-שמעון ואבראהים): שיום אותיות, מילות תפל, מילים מנוקדות ולא מנוקדות וקריאת טקסט.</w:t>
+        <w:t xml:space="preserve">כלי ההערכה: מבחני "آلية فحص: كراسة مهمات للتلميذ للصفوف الثالثة" (אסדי, שני, בן-שמעון ואבראהים): שיום אותיות, מילות תפל, מילים מנוקדות ולא מנוקדות וקריאת טקסט.</w:t>
       </w:r>
     </w:p>
     <w:p>
@@ -4172,11 +4147,6 @@
             </w:pPr>
             <w:r>
               <w:rPr>
-                <w:noProof/>
-              </w:rPr>
-            </w:r>
-            <w:r>
-              <w:rPr>
                 <w:rFonts w:ascii="David" w:hAnsi="David" w:cs="David" w:eastAsia="David"/>
                 <w:b w:val="0"/>
                 <w:i w:val="0"/>
@@ -4185,7 +4155,7 @@
                 <w:szCs w:val="20"/>
                 <w:noProof/>
               </w:rPr>
-              <w:t>נכון: שאלה 10 – אבי מנير שמח (بالسرور)</w:t>
+              <w:t xml:space="preserve">נכון: שאלה 10, אבי מנير שמח (بالسرور)</w:t>
             </w:r>
           </w:p>
         </w:tc>
@@ -4261,11 +4231,6 @@
             </w:pPr>
             <w:r>
               <w:rPr>
-                <w:noProof/>
-              </w:rPr>
-            </w:r>
-            <w:r>
-              <w:rPr>
                 <w:rFonts w:ascii="David" w:hAnsi="David" w:cs="David" w:eastAsia="David"/>
                 <w:b w:val="0"/>
                 <w:i w:val="0"/>
@@ -4274,7 +4239,7 @@
                 <w:szCs w:val="20"/>
                 <w:noProof/>
               </w:rPr>
-              <w:t>נכון: שאלה 18 – רامي סיפר על «حسن أخلاق منير»</w:t>
+              <w:t xml:space="preserve">נכון: שאלה 18, רامي סיפר על «حسن أخلاق منير»</w:t>
             </w:r>
           </w:p>
         </w:tc>
@@ -6209,11 +6174,6 @@
             </w:pPr>
             <w:r>
               <w:rPr>
-                <w:noProof/>
-              </w:rPr>
-            </w:r>
-            <w:r>
-              <w:rPr>
                 <w:rFonts w:ascii="David" w:hAnsi="David" w:cs="David" w:eastAsia="David"/>
                 <w:b w:val="0"/>
                 <w:i w:val="0"/>
@@ -6222,7 +6182,7 @@
                 <w:szCs w:val="20"/>
                 <w:noProof/>
               </w:rPr>
-              <w:t>א' – השוואת מספרים</w:t>
+              <w:t xml:space="preserve">א': השוואת מספרים</w:t>
             </w:r>
           </w:p>
         </w:tc>
@@ -6298,11 +6258,6 @@
             </w:pPr>
             <w:r>
               <w:rPr>
-                <w:noProof/>
-              </w:rPr>
-            </w:r>
-            <w:r>
-              <w:rPr>
                 <w:rFonts w:ascii="David" w:hAnsi="David" w:cs="David" w:eastAsia="David"/>
                 <w:b w:val="0"/>
                 <w:i w:val="0"/>
@@ -6311,7 +6266,7 @@
                 <w:szCs w:val="20"/>
                 <w:noProof/>
               </w:rPr>
-              <w:t>ב' – השוואת כמויות (נקודות)</w:t>
+              <w:t xml:space="preserve">ב': השוואת כמויות (נקודות)</w:t>
             </w:r>
           </w:p>
         </w:tc>
@@ -6387,11 +6342,6 @@
             </w:pPr>
             <w:r>
               <w:rPr>
-                <w:noProof/>
-              </w:rPr>
-            </w:r>
-            <w:r>
-              <w:rPr>
                 <w:rFonts w:ascii="David" w:hAnsi="David" w:cs="David" w:eastAsia="David"/>
                 <w:b w:val="0"/>
                 <w:i w:val="0"/>
@@ -6400,7 +6350,7 @@
                 <w:szCs w:val="20"/>
                 <w:noProof/>
               </w:rPr>
-              <w:t>ג' – עובדות יסוד</w:t>
+              <w:t xml:space="preserve">ג': עובדות יסוד</w:t>
             </w:r>
           </w:p>
         </w:tc>
@@ -6476,11 +6426,6 @@
             </w:pPr>
             <w:r>
               <w:rPr>
-                <w:noProof/>
-              </w:rPr>
-            </w:r>
-            <w:r>
-              <w:rPr>
                 <w:rFonts w:ascii="David" w:hAnsi="David" w:cs="David" w:eastAsia="David"/>
                 <w:b w:val="0"/>
                 <w:i w:val="0"/>
@@ -6489,7 +6434,7 @@
                 <w:szCs w:val="20"/>
                 <w:noProof/>
               </w:rPr>
-              <w:t>ד' – חישובים</w:t>
+              <w:t xml:space="preserve">ד': חישובים</w:t>
             </w:r>
           </w:p>
         </w:tc>
@@ -6565,11 +6510,6 @@
             </w:pPr>
             <w:r>
               <w:rPr>
-                <w:noProof/>
-              </w:rPr>
-            </w:r>
-            <w:r>
-              <w:rPr>
                 <w:rFonts w:ascii="David" w:hAnsi="David" w:cs="David" w:eastAsia="David"/>
                 <w:b w:val="0"/>
                 <w:i w:val="0"/>
@@ -6578,7 +6518,7 @@
                 <w:szCs w:val="20"/>
                 <w:noProof/>
               </w:rPr>
-              <w:t>ה' – בעיות מילוליות</w:t>
+              <w:t xml:space="preserve">ה': בעיות מילוליות</w:t>
             </w:r>
           </w:p>
         </w:tc>
@@ -6594,11 +6534,6 @@
             </w:pPr>
             <w:r>
               <w:rPr>
-                <w:noProof/>
-              </w:rPr>
-            </w:r>
-            <w:r>
-              <w:rPr>
                 <w:rFonts w:ascii="David" w:hAnsi="David" w:cs="David" w:eastAsia="David"/>
                 <w:b w:val="0"/>
                 <w:i w:val="0"/>
@@ -6607,7 +6542,7 @@
                 <w:szCs w:val="20"/>
                 <w:noProof/>
               </w:rPr>
-              <w:t>1/5 (20%); בשתיים נוספות – חלקי</w:t>
+              <w:t xml:space="preserve">1/5 (20%); בשתיים נוספות מענה חלקי</w:t>
             </w:r>
           </w:p>
         </w:tc>
@@ -7152,11 +7087,6 @@
             </w:pPr>
             <w:r>
               <w:rPr>
-                <w:noProof/>
-              </w:rPr>
-            </w:r>
-            <w:r>
-              <w:rPr>
                 <w:rFonts w:ascii="David" w:hAnsi="David" w:cs="David" w:eastAsia="David"/>
                 <w:b w:val="0"/>
                 <w:i w:val="0"/>
@@ -7165,7 +7095,7 @@
                 <w:szCs w:val="18"/>
                 <w:noProof/>
               </w:rPr>
-              <w:t>חיבור בסיסי – שליפה שגויה</w:t>
+              <w:t xml:space="preserve">חיבור בסיסי, שליפה שגויה</w:t>
             </w:r>
           </w:p>
         </w:tc>
@@ -7270,11 +7200,6 @@
             </w:pPr>
             <w:r>
               <w:rPr>
-                <w:noProof/>
-              </w:rPr>
-            </w:r>
-            <w:r>
-              <w:rPr>
                 <w:rFonts w:ascii="David" w:hAnsi="David" w:cs="David" w:eastAsia="David"/>
                 <w:b w:val="0"/>
                 <w:i w:val="0"/>
@@ -7283,7 +7208,7 @@
                 <w:szCs w:val="18"/>
                 <w:noProof/>
               </w:rPr>
-              <w:t>חיבור בסיסי – שליפה שגויה</w:t>
+              <w:t xml:space="preserve">חיבור בסיסי, שליפה שגויה</w:t>
             </w:r>
           </w:p>
         </w:tc>
@@ -8785,7 +8710,7 @@
           <w:bCs/>
           <w:noProof/>
         </w:rPr>
-        <w:t>זיכרון עבודה מילולי – משפטים וחזרה ברצף (א-ת, חלוץ):</w:t>
+        <w:t xml:space="preserve">זיכרון עבודה מילולי: משפטים וחזרה ברצף (א-ת, חלוץ):</w:t>
       </w:r>
       <w:r>
         <w:rPr>
@@ -9337,11 +9262,6 @@
             </w:pPr>
             <w:r>
               <w:rPr>
-                <w:noProof/>
-              </w:rPr>
-            </w:r>
-            <w:r>
-              <w:rPr>
                 <w:rFonts w:ascii="David" w:hAnsi="David" w:cs="David" w:eastAsia="David"/>
                 <w:b w:val="0"/>
                 <w:i w:val="0"/>
@@ -9350,7 +9270,7 @@
                 <w:szCs w:val="20"/>
                 <w:noProof/>
               </w:rPr>
-              <w:t>—</w:t>
+              <w:t xml:space="preserve"/>
             </w:r>
           </w:p>
         </w:tc>
@@ -9366,11 +9286,6 @@
             </w:pPr>
             <w:r>
               <w:rPr>
-                <w:noProof/>
-              </w:rPr>
-            </w:r>
-            <w:r>
-              <w:rPr>
                 <w:rFonts w:ascii="David" w:hAnsi="David" w:cs="David" w:eastAsia="David"/>
                 <w:b w:val="0"/>
                 <w:i w:val="0"/>
@@ -9379,7 +9294,7 @@
                 <w:szCs w:val="20"/>
                 <w:noProof/>
               </w:rPr>
-              <w:t>—</w:t>
+              <w:t xml:space="preserve"/>
             </w:r>
           </w:p>
         </w:tc>
@@ -9455,7 +9370,19 @@
           <w:bCs/>
           <w:noProof/>
         </w:rPr>
-        <w:t>למידה מילולית-שמיעתית – Rey AVLT (גרסה ערבית):</w:t>
+        <w:t xml:space="preserve">למידה מילולית-שמיעתית: Rey AVLT (גרסה ערבית):</w:t>
+      </w:r>
+      <w:r>
+        <w:rPr>
+          <w:rFonts w:ascii="David" w:hAnsi="David" w:cs="David" w:eastAsia="David"/>
+          <w:b w:val="0"/>
+          <w:i w:val="0"/>
+          <w:sz w:val="24"/>
+          <w:rtl/>
+          <w:szCs w:val="24"/>
+          <w:noProof/>
+        </w:rPr>
+        <w:t xml:space="preserve"/>
       </w:r>
     </w:p>
     <w:tbl>
@@ -10173,7 +10100,20 @@
           <w:bCs/>
           <w:noProof/>
         </w:rPr>
-        <w:t>שאלון DuPaul – מחנכת</w:t>
+        <w:t xml:space="preserve">שאלון DuPaul למחנכת</w:t>
+      </w:r>
+      <w:r>
+        <w:rPr>
+          <w:rFonts w:ascii="David" w:hAnsi="David" w:cs="David" w:eastAsia="David"/>
+          <w:b w:val="0"/>
+          <w:i w:val="0"/>
+          <w:color w:val="2E5597"/>
+          <w:sz w:val="24"/>
+          <w:rtl/>
+          <w:szCs w:val="24"/>
+          <w:noProof/>
+        </w:rPr>
+        <w:t xml:space="preserve"/>
       </w:r>
     </w:p>
     <w:tbl>
@@ -10622,7 +10562,20 @@
           <w:bCs/>
           <w:noProof/>
         </w:rPr>
-        <w:t>שאלון DuPaul – הורים</w:t>
+        <w:t xml:space="preserve">שאלון DuPaul להורים</w:t>
+      </w:r>
+      <w:r>
+        <w:rPr>
+          <w:rFonts w:ascii="David" w:hAnsi="David" w:cs="David" w:eastAsia="David"/>
+          <w:b w:val="0"/>
+          <w:i w:val="0"/>
+          <w:color w:val="2E5597"/>
+          <w:sz w:val="24"/>
+          <w:rtl/>
+          <w:szCs w:val="24"/>
+          <w:noProof/>
+        </w:rPr>
+        <w:t xml:space="preserve"/>
       </w:r>
     </w:p>
     <w:tbl>
@@ -11286,7 +11239,20 @@
           <w:bCs/>
           <w:noProof/>
         </w:rPr>
-        <w:t>תפקודים ניהוליים – BRIEF</w:t>
+        <w:t xml:space="preserve">תפקודים ניהוליים (BRIEF)</w:t>
+      </w:r>
+      <w:r>
+        <w:rPr>
+          <w:rFonts w:ascii="David" w:hAnsi="David" w:cs="David" w:eastAsia="David"/>
+          <w:b w:val="0"/>
+          <w:i w:val="0"/>
+          <w:color w:val="2E5597"/>
+          <w:sz w:val="24"/>
+          <w:rtl/>
+          <w:szCs w:val="24"/>
+          <w:noProof/>
+        </w:rPr>
+        <w:t xml:space="preserve"/>
       </w:r>
     </w:p>
     <w:p>
@@ -11485,7 +11451,20 @@
           <w:bCs/>
           <w:noProof/>
         </w:rPr>
-        <w:t>סכמה – קשרים בין רמת ההישגים לבין המנגנונים</w:t>
+        <w:t xml:space="preserve">סכמה: קשרים בין רמת ההישגים לבין המנגנונים</w:t>
+      </w:r>
+      <w:r>
+        <w:rPr>
+          <w:rFonts w:ascii="David" w:hAnsi="David" w:cs="David" w:eastAsia="David"/>
+          <w:b w:val="0"/>
+          <w:i w:val="0"/>
+          <w:color w:val="1F3864"/>
+          <w:sz w:val="28"/>
+          <w:rtl/>
+          <w:szCs w:val="28"/>
+          <w:noProof/>
+        </w:rPr>
+        <w:t xml:space="preserve"/>
       </w:r>
     </w:p>
     <w:p>
@@ -12589,11 +12568,6 @@
             </w:pPr>
             <w:r>
               <w:rPr>
-                <w:noProof/>
-              </w:rPr>
-            </w:r>
-            <w:r>
-              <w:rPr>
                 <w:rFonts w:ascii="David" w:hAnsi="David" w:cs="David" w:eastAsia="David"/>
                 <w:b w:val="0"/>
                 <w:i w:val="0"/>
@@ -12602,7 +12576,7 @@
                 <w:szCs w:val="16"/>
                 <w:noProof/>
               </w:rPr>
-              <w:t>—</w:t>
+              <w:t xml:space="preserve">חשיבה בלתי מילולית בטווח הממוצע-נמוך</w:t>
             </w:r>
           </w:p>
         </w:tc>
@@ -12647,11 +12621,6 @@
             </w:pPr>
             <w:r>
               <w:rPr>
-                <w:noProof/>
-              </w:rPr>
-            </w:r>
-            <w:r>
-              <w:rPr>
                 <w:rFonts w:ascii="David" w:hAnsi="David" w:cs="David" w:eastAsia="David"/>
                 <w:b w:val="0"/>
                 <w:i w:val="0"/>
@@ -12660,7 +12629,7 @@
                 <w:szCs w:val="16"/>
                 <w:noProof/>
               </w:rPr>
-              <w:t>—</w:t>
+              <w:t xml:space="preserve">רייבן CPM: 21/36, אחוזון 30 בקירוב</w:t>
             </w:r>
           </w:p>
         </w:tc>
@@ -12684,7 +12653,7 @@
                 <w:szCs w:val="16"/>
                 <w:noProof/>
               </w:rPr>
-              <w:t xml:space="preserve">רייבן הועבר: 21/36, אחוזון 30 בקירוב, טווח תקין</w:t>
+              <w:t xml:space="preserve">הושלם; אבחון חוזר בסוף כיתה ד'</w:t>
             </w:r>
           </w:p>
         </w:tc>
@@ -13130,7 +13099,7 @@
           <w:bCs/>
           <w:noProof/>
         </w:rPr>
-        <w:t>מענה לשאלת ההפניה – מדוע סמיר מתקשה בכל המקצועות?</w:t>
+        <w:t xml:space="preserve">מענה לשאלת ההפניה: מדוע סמיר מתקשה בכל המקצועות?</w:t>
       </w:r>
       <w:r>
         <w:rPr>
@@ -13254,7 +13223,19 @@
           <w:bCs/>
           <w:noProof/>
         </w:rPr>
-        <w:t>שלילת הסברים חלופיים – לפני קביעת אבחנה יש לבדוק:</w:t>
+        <w:t xml:space="preserve">שלילת הסברים חלופיים: לפני קביעת אבחנה יש לבדוק:</w:t>
+      </w:r>
+      <w:r>
+        <w:rPr>
+          <w:rFonts w:ascii="David" w:hAnsi="David" w:cs="David" w:eastAsia="David"/>
+          <w:b w:val="0"/>
+          <w:i w:val="0"/>
+          <w:sz w:val="24"/>
+          <w:rtl/>
+          <w:szCs w:val="24"/>
+          <w:noProof/>
+        </w:rPr>
+        <w:t xml:space="preserve"/>
       </w:r>
     </w:p>
     <w:p>
@@ -15347,11 +15328,6 @@
             </w:pPr>
             <w:r>
               <w:rPr>
-                <w:noProof/>
-              </w:rPr>
-            </w:r>
-            <w:r>
-              <w:rPr>
                 <w:rFonts w:ascii="David" w:hAnsi="David" w:cs="David" w:eastAsia="David"/>
                 <w:b w:val="0"/>
                 <w:i w:val="0"/>
@@ -15360,7 +15336,7 @@
                 <w:szCs w:val="16"/>
                 <w:noProof/>
               </w:rPr>
-              <w:t>חשבון – ערך מקום</w:t>
+              <w:t xml:space="preserve">חשבון: ערך מקום</w:t>
             </w:r>
           </w:p>
         </w:tc>
@@ -15494,11 +15470,6 @@
             </w:pPr>
             <w:r>
               <w:rPr>
-                <w:noProof/>
-              </w:rPr>
-            </w:r>
-            <w:r>
-              <w:rPr>
                 <w:rFonts w:ascii="David" w:hAnsi="David" w:cs="David" w:eastAsia="David"/>
                 <w:b w:val="0"/>
                 <w:i w:val="0"/>
@@ -15507,7 +15478,7 @@
                 <w:szCs w:val="16"/>
                 <w:noProof/>
               </w:rPr>
-              <w:t>חשבון – עובדות</w:t>
+              <w:t xml:space="preserve">חשבון: עובדות</w:t>
             </w:r>
           </w:p>
         </w:tc>
@@ -15641,11 +15612,6 @@
             </w:pPr>
             <w:r>
               <w:rPr>
-                <w:noProof/>
-              </w:rPr>
-            </w:r>
-            <w:r>
-              <w:rPr>
                 <w:rFonts w:ascii="David" w:hAnsi="David" w:cs="David" w:eastAsia="David"/>
                 <w:b w:val="0"/>
                 <w:i w:val="0"/>
@@ -15654,7 +15620,7 @@
                 <w:szCs w:val="16"/>
                 <w:noProof/>
               </w:rPr>
-              <w:t>חשבון – בעיות</w:t>
+              <w:t xml:space="preserve">חשבון: בעיות</w:t>
             </w:r>
           </w:p>
         </w:tc>
@@ -16644,11 +16610,6 @@
             </w:pPr>
             <w:r>
               <w:rPr>
-                <w:noProof/>
-              </w:rPr>
-            </w:r>
-            <w:r>
-              <w:rPr>
                 <w:rFonts w:ascii="David" w:hAnsi="David" w:cs="David" w:eastAsia="David"/>
                 <w:b w:val="0"/>
                 <w:i w:val="0"/>
@@ -16657,7 +16618,7 @@
                 <w:szCs w:val="18"/>
                 <w:noProof/>
               </w:rPr>
-              <w:t>النحلة العاملة – 3/10 (30%)</w:t>
+              <w:t xml:space="preserve">النحلة العاملة: 3/10 (30%)</w:t>
             </w:r>
           </w:p>
         </w:tc>
@@ -16989,11 +16950,6 @@
             </w:pPr>
             <w:r>
               <w:rPr>
-                <w:noProof/>
-              </w:rPr>
-            </w:r>
-            <w:r>
-              <w:rPr>
                 <w:rFonts w:ascii="David" w:hAnsi="David" w:cs="David" w:eastAsia="David"/>
                 <w:b w:val="0"/>
                 <w:i w:val="0"/>
@@ -17002,7 +16958,7 @@
                 <w:szCs w:val="18"/>
                 <w:noProof/>
               </w:rPr>
-              <w:t>فهم مسموع – 2/18 (11%)</w:t>
+              <w:t xml:space="preserve">فهم مسموع: 2/18 (11%)</w:t>
             </w:r>
           </w:p>
         </w:tc>
@@ -19579,11 +19535,6 @@
             </w:pPr>
             <w:r>
               <w:rPr>
-                <w:noProof/>
-              </w:rPr>
-            </w:r>
-            <w:r>
-              <w:rPr>
                 <w:rFonts w:ascii="David" w:hAnsi="David" w:cs="David" w:eastAsia="David"/>
                 <w:b w:val="0"/>
                 <w:i w:val="0"/>
@@ -19592,7 +19543,7 @@
                 <w:szCs w:val="18"/>
                 <w:noProof/>
               </w:rPr>
-              <w:t>זכירת משפטים ברצף (א-ת חלוץ) – טווח 2</w:t>
+              <w:t xml:space="preserve">זכירת משפטים ברצף (א-ת חלוץ): טווח 2</w:t>
             </w:r>
           </w:p>
         </w:tc>
@@ -20757,11 +20708,6 @@
             </w:pPr>
             <w:r>
               <w:rPr>
-                <w:noProof/>
-              </w:rPr>
-            </w:r>
-            <w:r>
-              <w:rPr>
                 <w:rFonts w:ascii="David" w:hAnsi="David" w:cs="David" w:eastAsia="David"/>
                 <w:b w:val="0"/>
                 <w:i w:val="0"/>
@@ -20770,7 +20716,7 @@
                 <w:szCs w:val="18"/>
                 <w:noProof/>
               </w:rPr>
-              <w:t>DuPaul – מחנכת</w:t>
+              <w:t xml:space="preserve">DuPaul מחנכת</w:t>
             </w:r>
           </w:p>
         </w:tc>
@@ -20930,11 +20876,6 @@
             </w:pPr>
             <w:r>
               <w:rPr>
-                <w:noProof/>
-              </w:rPr>
-            </w:r>
-            <w:r>
-              <w:rPr>
                 <w:rFonts w:ascii="David" w:hAnsi="David" w:cs="David" w:eastAsia="David"/>
                 <w:b w:val="0"/>
                 <w:i w:val="0"/>
@@ -20943,7 +20884,7 @@
                 <w:szCs w:val="18"/>
                 <w:noProof/>
               </w:rPr>
-              <w:t>DuPaul – הורים</w:t>
+              <w:t xml:space="preserve">DuPaul הורים</w:t>
             </w:r>
           </w:p>
         </w:tc>
@@ -21952,7 +21893,7 @@
           <w:szCs w:val="22"/>
           <w:noProof/>
         </w:rPr>
-        <w:t xml:space="preserve">נספח ב' – תלקיט: תוצרי הנבדק בכל המטלות שהועברו, דף הרייבן, דפי הקריאה וההכתבה ושאלון DuPaul של ההורים כפי שמולא, מצורפים בקובץ נפרד ("תלקיט_סמיר").</w:t>
+        <w:t xml:space="preserve">נספח ב': תלקיט: תוצרי הנבדק בכל המטלות שהועברו, דף הרייבן, דפי הקריאה וההכתבה ושאלון DuPaul של ההורים כפי שמולא, מצורפים בקובץ נפרד ("תלקיט_סמיר").</w:t>
       </w:r>
     </w:p>
     <w:sectPr>

</xml_diff>

<commit_message>
Add appendix C with the DuPaul questionnaires and interview summaries for the assessment report
Co-Authored-By: Claude Fable 5.1 <noreply@anthropic.com>
Claude-Session: https://claude.ai/code/session_011Z9C2ptByc9jQga6MDruQz
</commit_message>
<xml_diff>
--- a/deliverables/דוח_אבחון_סמיר_מושלם.docx
+++ b/deliverables/דוח_אבחון_סמיר_מושלם.docx
@@ -21896,6 +21896,25 @@
         <w:t xml:space="preserve">נספח ב': תלקיט: תוצרי הנבדק בכל המטלות שהועברו, דף הרייבן, דפי הקריאה וההכתבה ושאלון DuPaul של ההורים כפי שמולא, מצורפים בקובץ נפרד ("תלקיט_סמיר").</w:t>
       </w:r>
     </w:p>
+    <w:p>
+      <w:pPr>
+        <w:bidi/>
+        <w:spacing w:line="360" w:lineRule="auto" w:after="80" w:before="0"/>
+        <w:jc w:val="right"/>
+      </w:pPr>
+      <w:r>
+        <w:rPr>
+          <w:rFonts w:ascii="David" w:hAnsi="David" w:cs="David" w:eastAsia="David"/>
+          <w:b w:val="0"/>
+          <w:i w:val="0"/>
+          <w:sz w:val="22"/>
+          <w:rtl/>
+          <w:szCs w:val="22"/>
+          <w:noProof/>
+        </w:rPr>
+        <w:t xml:space="preserve">נספח ג': שאלוני DuPaul (מחנכת והורים) וסיכומי הראיונות עם האם ועם המחנכת מצורפים בקובץ נפרד ("נספח_ג_סמיר").</w:t>
+      </w:r>
+    </w:p>
     <w:sectPr>
       <w:footerReference w:type="default" r:id="rId9"/>
       <w:headerReference w:type="default" r:id="rId10"/>

</xml_diff>

<commit_message>
Complete all remaining assessment tools in the fictional didactic report
Co-Authored-By: Claude Fable 5.1 <noreply@anthropic.com>
Claude-Session: https://claude.ai/code/session_011Z9C2ptByc9jQga6MDruQz
</commit_message>
<xml_diff>
--- a/deliverables/דוח_אבחון_סמיר_מושלם.docx
+++ b/deliverables/דוח_אבחון_סמיר_מושלם.docx
@@ -948,7 +948,7 @@
                 <w:szCs w:val="20"/>
                 <w:noProof/>
               </w:rPr>
-              <w:t xml:space="preserve">1.10.2026, 7.10.2026, 21.10.2026</w:t>
+              <w:t xml:space="preserve">1.10.2026, 7.10.2026, 21.10.2026, 26.10.2026, 28.10.2026</w:t>
             </w:r>
           </w:p>
         </w:tc>
@@ -1001,7 +1001,7 @@
                 <w:szCs w:val="20"/>
                 <w:noProof/>
               </w:rPr>
-              <w:t xml:space="preserve">23.10.2026</w:t>
+              <w:t xml:space="preserve">30.10.2026</w:t>
             </w:r>
           </w:p>
         </w:tc>
@@ -1230,7 +1230,7 @@
                 <w:szCs w:val="20"/>
                 <w:noProof/>
               </w:rPr>
-              <w:t xml:space="preserve">3 (1.10.2026, 7.10.2026, 21.10.2026)</w:t>
+              <w:t xml:space="preserve">5 (1.10, 7.10, 21.10, 26.10, 28.10.2026)</w:t>
             </w:r>
           </w:p>
         </w:tc>
@@ -1463,7 +1463,7 @@
           <w:szCs w:val="24"/>
           <w:noProof/>
         </w:rPr>
-        <w:t xml:space="preserve">שאלון DuPaul שמילאה המחנכת, ראיון עם המחנכת (20.10.2026), ראיון טלפוני עם אם הנבדק (19.10.2026) ושאלון DuPaul להורים שמולא במהלכו, תוצרי הנבדק במטלות האבחון ותצפית המאבחנת.</w:t>
+        <w:t xml:space="preserve">שאלון DuPaul שמילאה המחנכת, ראיון עם המחנכת (20.10.2026), ראיון טלפוני עם אם הנבדק (19.10.2026) ושאלון DuPaul להורים שמולא במהלכו, שאלוני BRIEF למחנכת ולהורים (27.10.2026), תוצרי הנבדק במטלות האבחון ותצפית המאבחנת.</w:t>
       </w:r>
     </w:p>
     <w:p>
@@ -1482,7 +1482,7 @@
           <w:szCs w:val="24"/>
           <w:noProof/>
         </w:rPr>
-        <w:t xml:space="preserve">שאלוני BRIEF להורים ולמורים לא הועברו.</w:t>
+        <w:t xml:space="preserve">שאלוני BRIEF מולאו על ידי המחנכת ועל ידי האם ב-27.10.2026.</w:t>
       </w:r>
     </w:p>
     <w:p>
@@ -2365,7 +2365,45 @@
           <w:szCs w:val="24"/>
           <w:noProof/>
         </w:rPr>
-        <w:t xml:space="preserve">קריאת מילות תפל (מטלה 4.2): 3 מתוך 10 ב-70 שניות. בשתיים סירב לנסות ("זה לא מילה"), ובארבע הפך את מילת התפל למילה אמיתית דומה. הפער בין מילים למילות תפל מעיד על הישענות על זיהוי חזותי של מילים מוכרות, ועל פענוח פונולוגי חלש ולא מדויק. הממצא מתיישב עם שגיאות ההעתקה ועם הבחירה לפי מיקום בהבנת הנשמע: סמיר מגיע לטקסט עם כלי פענוח חלקיים, ולכן מתאימה לו אסטרטגיה של התאמת מילים. שיום אותיות (3.1) וקריאת טקסט (4.3) לא הועברו.</w:t>
+        <w:t xml:space="preserve">קריאת מילות תפל (מטלה 4.2): 3 מתוך 10 ב-70 שניות. בשתיים סירב לנסות ("זה לא מילה"), ובארבע הפך את מילת התפל למילה אמיתית דומה. הפער בין מילים למילות תפל מעיד על הישענות על זיהוי חזותי של מילים מוכרות, ועל פענוח פונולוגי חלש ולא מדויק. הממצא מתיישב עם שגיאות ההעתקה ועם הבחירה לפי מיקום בהבנת הנשמע: סמיר מגיע לטקסט עם כלי פענוח חלקיים, ולכן מתאימה לו אסטרטגיה של התאמת מילים.</w:t>
+      </w:r>
+    </w:p>
+    <w:p>
+      <w:pPr>
+        <w:bidi/>
+        <w:spacing w:line="360" w:lineRule="auto" w:after="80" w:before="0"/>
+        <w:jc w:val="both"/>
+      </w:pPr>
+      <w:r>
+        <w:rPr>
+          <w:rFonts w:ascii="David" w:hAnsi="David" w:cs="David" w:eastAsia="David"/>
+          <w:b w:val="0"/>
+          <w:i w:val="0"/>
+          <w:sz w:val="24"/>
+          <w:rtl/>
+          <w:szCs w:val="24"/>
+          <w:noProof/>
+        </w:rPr>
+        <w:t xml:space="preserve">שיום אותיות (מטלה 3.1, 28.10.2026): סמיר שיים נכון 24 מתוך 28 אותיות ב-55 שניות. הבלבולים: ت/ث, ج/خ ו-ص/ض, כלומר אותיות שנבדלות בנקודות או בצורה דומה. הקצב איטי ביחס לכיתה ג', ובכמה אותיות עצר וחשב לפני שענה. ידע האותיות קיים ברובו, אבל אינו אוטומטי.</w:t>
+      </w:r>
+    </w:p>
+    <w:p>
+      <w:pPr>
+        <w:bidi/>
+        <w:spacing w:line="360" w:lineRule="auto" w:after="80" w:before="0"/>
+        <w:jc w:val="both"/>
+      </w:pPr>
+      <w:r>
+        <w:rPr>
+          <w:rFonts w:ascii="David" w:hAnsi="David" w:cs="David" w:eastAsia="David"/>
+          <w:b w:val="0"/>
+          <w:i w:val="0"/>
+          <w:sz w:val="24"/>
+          <w:rtl/>
+          <w:szCs w:val="24"/>
+          <w:noProof/>
+        </w:rPr>
+        <w:t xml:space="preserve">קריאת טקסט (מטלה 4.3, 28.10.2026): טקסט סיפורי מנוקד בן 60 מילים לכיתה ג'. סמיר קרא 38 מילים נכון (63%) ב-3:10 דקות, כלומר כ-19 מילים בדקה. הוא קרא מילה-מילה, בלי הנגנה, עם 22 שגיאות: החלפות של מילים דומות חזותית (11), שגיאות בתנועות (6), השמטות (3) ושתי מילים שדילג עליהן. תיקן את עצמו פעמיים בלבד. הקצב והדיוק נמוכים מאוד ביחס למצופה בכיתה ג', ומסבירים מדוע הקריאה כמעט אינה משאירה משאבים להבנה.</w:t>
       </w:r>
     </w:p>
     <w:p>
@@ -3834,7 +3872,7 @@
           <w:szCs w:val="24"/>
           <w:noProof/>
         </w:rPr>
-        <w:t>שלב התערבות מובנה בהבנת הנקרא לא תועד, ומטלה 1.1 מהחוברת לא הועברה. לפי התרשמות הבוחנת, הקראה והכוונה עזרו לסמיר מעט בלבד.</w:t>
+        <w:t xml:space="preserve">מטלה 1.1 (28.10.2026): טקסט מידעי קצר נוסף עם 8 שאלות. בקריאה עצמאית ענה סמיר נכון על 2 מתוך 8, שוב רק בשאלות איתור גלוי. שלב התערבות: הבוחנת הקריאה את הטקסט פסקה-פסקה, לימדה לסמן מילת מפתח בשאלה ולחזור לפסקה המתאימה, ודגמה שאלת "למה" אחת. באותן שאלות, אחרי התיווך, ענה נכון על 4 מתוך 8, כולל שאלת היסק אחת ושאלת רצף. השיפור חלקי: ההקראה והאסטרטגיה עזרו באיתור ובהיסק פשוט, אבל לא בשאלות הערכה ומשמעות מילה. המסקנה: חלק מהקושי בהבנה נובע מהפענוח ומהיעדר אסטרטגיה, ואפשר לקדמו בתיווך; וחלק נובע מהבנה לשונית, ומצריך עבודה על אוצר מילים ותחביר.</w:t>
       </w:r>
     </w:p>
     <w:p>
@@ -4332,8 +4370,15 @@
           <w:szCs w:val="24"/>
           <w:noProof/>
         </w:rPr>
-        <w:t xml:space="preserve">מבחני השפה הדבורה (מודעות מורפולוגית, ידע תחבירי, אוצר מילים, מעש"ה ושיח) </w:t>
+        <w:t xml:space="preserve">מבחני השפה הדבורה הועברו ב-26.10.2026, לאור הדיבור המאוחר והבנת הנשמע הנמוכה.</w:t>
       </w:r>
+    </w:p>
+    <w:p>
+      <w:pPr>
+        <w:bidi/>
+        <w:spacing w:line="360" w:lineRule="auto" w:after="80" w:before="0"/>
+        <w:jc w:val="both"/>
+      </w:pPr>
       <w:r>
         <w:rPr>
           <w:rFonts w:ascii="David" w:hAnsi="David" w:cs="David" w:eastAsia="David"/>
@@ -4345,7 +4390,7 @@
           <w:bCs/>
           <w:noProof/>
         </w:rPr>
-        <w:t>לא הועברו במסגרת אבחון זה</w:t>
+        <w:t xml:space="preserve">אוצר מילים ("كلمات" 7.1):</w:t>
       </w:r>
       <w:r>
         <w:rPr>
@@ -4357,7 +4402,167 @@
           <w:szCs w:val="24"/>
           <w:noProof/>
         </w:rPr>
-        <w:t>. לאור הדיבור המאוחר והבנת הנשמע הנמוכה, יש לכך חשיבות רבה בהערכת ההמשך.</w:t>
+        <w:t xml:space="preserve"> סמיר ענה נכון על 11 מתוך 20 פריטים (55%). השגיאות היו בעיקר במילים מהשפה הספרותית שאינן בשימוש בניב המדובר (למשל «يَسْتَيْقِظُ», «مَنْزِل»), ובכמה מהן אמר את המילה המקבילה מהניב ("بيصحى", "دار"). אוצר המילים הפסיבי בערבית הספרותית נמוך ביחס לכיתה ג'.</w:t>
+      </w:r>
+    </w:p>
+    <w:p>
+      <w:pPr>
+        <w:bidi/>
+        <w:spacing w:line="360" w:lineRule="auto" w:after="80" w:before="0"/>
+        <w:jc w:val="both"/>
+      </w:pPr>
+      <w:r>
+        <w:rPr>
+          <w:rFonts w:ascii="David" w:hAnsi="David" w:cs="David" w:eastAsia="David"/>
+          <w:b/>
+          <w:i w:val="0"/>
+          <w:sz w:val="24"/>
+          <w:rtl/>
+          <w:szCs w:val="24"/>
+          <w:bCs/>
+          <w:noProof/>
+        </w:rPr>
+        <w:t xml:space="preserve">מעש"ה (הגדרת מילים בעל פה):</w:t>
+      </w:r>
+      <w:r>
+        <w:rPr>
+          <w:rFonts w:ascii="David" w:hAnsi="David" w:cs="David" w:eastAsia="David"/>
+          <w:b w:val="0"/>
+          <w:i w:val="0"/>
+          <w:sz w:val="24"/>
+          <w:rtl/>
+          <w:szCs w:val="24"/>
+          <w:noProof/>
+        </w:rPr>
+        <w:t xml:space="preserve"> 9 מתוך 20 הגדרות מלאות, 6 חלקיות (תיאור של שימוש בלבד, "זה בשביל לחתוך") ו-5 ללא מענה. ההגדרות קצרות, בניב המדובר, וללא מילת-על (קטגוריה).</w:t>
+      </w:r>
+    </w:p>
+    <w:p>
+      <w:pPr>
+        <w:bidi/>
+        <w:spacing w:line="360" w:lineRule="auto" w:after="80" w:before="0"/>
+        <w:jc w:val="both"/>
+      </w:pPr>
+      <w:r>
+        <w:rPr>
+          <w:rFonts w:ascii="David" w:hAnsi="David" w:cs="David" w:eastAsia="David"/>
+          <w:b/>
+          <w:i w:val="0"/>
+          <w:sz w:val="24"/>
+          <w:rtl/>
+          <w:szCs w:val="24"/>
+          <w:bCs/>
+          <w:noProof/>
+        </w:rPr>
+        <w:t xml:space="preserve">ידע תחבירי (الضمير العائد 8.1):</w:t>
+      </w:r>
+      <w:r>
+        <w:rPr>
+          <w:rFonts w:ascii="David" w:hAnsi="David" w:cs="David" w:eastAsia="David"/>
+          <w:b w:val="0"/>
+          <w:i w:val="0"/>
+          <w:sz w:val="24"/>
+          <w:rtl/>
+          <w:szCs w:val="24"/>
+          <w:noProof/>
+        </w:rPr>
+        <w:t xml:space="preserve"> 6 מתוך 12 (50%). סמיר זיהה נכון את הכינוי החוזר כשהמילה שאליה הוא מתייחס הייתה סמוכה, וטעה כמעט בכל הפריטים שבהם המרחק היה משפט או יותר. הממצא מתיישב עם טווח זיכרון העבודה הנמוך, ומסביר חלק מהקושי בהבנת טקסט רציף.</w:t>
+      </w:r>
+    </w:p>
+    <w:p>
+      <w:pPr>
+        <w:bidi/>
+        <w:spacing w:line="360" w:lineRule="auto" w:after="80" w:before="0"/>
+        <w:jc w:val="both"/>
+      </w:pPr>
+      <w:r>
+        <w:rPr>
+          <w:rFonts w:ascii="David" w:hAnsi="David" w:cs="David" w:eastAsia="David"/>
+          <w:b/>
+          <w:i w:val="0"/>
+          <w:sz w:val="24"/>
+          <w:rtl/>
+          <w:szCs w:val="24"/>
+          <w:bCs/>
+          <w:noProof/>
+        </w:rPr>
+        <w:t xml:space="preserve">מודעות מורפולוגית (9.1, 9.2):</w:t>
+      </w:r>
+      <w:r>
+        <w:rPr>
+          <w:rFonts w:ascii="David" w:hAnsi="David" w:cs="David" w:eastAsia="David"/>
+          <w:b w:val="0"/>
+          <w:i w:val="0"/>
+          <w:sz w:val="24"/>
+          <w:rtl/>
+          <w:szCs w:val="24"/>
+          <w:noProof/>
+        </w:rPr>
+        <w:t xml:space="preserve"> בהטיה (9.1) 7 מתוך 15, ובשיפוט מורפולוגי (9.2) 8 מתוך 12. הוא מצליח בהטיות שכיחות של יחיד-רבים ובזמן עבר-הווה, ומתקשה בגזירה ממשקל ובצורות של השפה הספרותית בלבד. ידע מורפולוגי חלקי פוגע גם בקריאה (זיהוי מילה לפי שורש ומשקל) וגם בכתיב.</w:t>
+      </w:r>
+    </w:p>
+    <w:p>
+      <w:pPr>
+        <w:bidi/>
+        <w:spacing w:line="360" w:lineRule="auto" w:after="80" w:before="0"/>
+        <w:jc w:val="both"/>
+      </w:pPr>
+      <w:r>
+        <w:rPr>
+          <w:rFonts w:ascii="David" w:hAnsi="David" w:cs="David" w:eastAsia="David"/>
+          <w:b/>
+          <w:i w:val="0"/>
+          <w:sz w:val="24"/>
+          <w:rtl/>
+          <w:szCs w:val="24"/>
+          <w:bCs/>
+          <w:noProof/>
+        </w:rPr>
+        <w:t xml:space="preserve">שיח:</w:t>
+      </w:r>
+      <w:r>
+        <w:rPr>
+          <w:rFonts w:ascii="David" w:hAnsi="David" w:cs="David" w:eastAsia="David"/>
+          <w:b w:val="0"/>
+          <w:i w:val="0"/>
+          <w:sz w:val="24"/>
+          <w:rtl/>
+          <w:szCs w:val="24"/>
+          <w:noProof/>
+        </w:rPr>
+        <w:t xml:space="preserve"> סמיר התבקש לספר סיפור לפי רצף של ארבע תמונות. הפיק חמישה משפטים קצרים, רובם בניב המדובר, עם "ואז" כמילת הקישור היחידה. שמר על הרצף בשלוש תמונות מתוך ארבע, ולא סיפר את הסוף. התוכן בעל פה עשיר יותר מהתוכן בכתב (חמישה משפטים לעומת אחד), ולכן הפער בין ההבעה בעל פה לכתב תומך בהסבר של עומס התעתוק, לצד חולשה שפתית כללית.</w:t>
+      </w:r>
+    </w:p>
+    <w:p>
+      <w:pPr>
+        <w:bidi/>
+        <w:spacing w:line="360" w:lineRule="auto" w:after="80" w:before="0"/>
+        <w:jc w:val="both"/>
+      </w:pPr>
+      <w:r>
+        <w:rPr>
+          <w:rFonts w:ascii="David" w:hAnsi="David" w:cs="David" w:eastAsia="David"/>
+          <w:b/>
+          <w:i w:val="0"/>
+          <w:sz w:val="24"/>
+          <w:rtl/>
+          <w:szCs w:val="24"/>
+          <w:bCs/>
+          <w:noProof/>
+        </w:rPr>
+        <w:t xml:space="preserve">סיכום השפה הדבורה:</w:t>
+      </w:r>
+      <w:r>
+        <w:rPr>
+          <w:rFonts w:ascii="David" w:hAnsi="David" w:cs="David" w:eastAsia="David"/>
+          <w:b w:val="0"/>
+          <w:i w:val="0"/>
+          <w:sz w:val="24"/>
+          <w:rtl/>
+          <w:szCs w:val="24"/>
+          <w:noProof/>
+        </w:rPr>
+        <w:t xml:space="preserve"> בכל המדדים התקבל תפקוד נמוך ביחס לכיתה ג', עם פער בולט בין הניב המדובר לשפה הספרותית. הממצאים מאששים את החשד לחולשה שפתית התפתחותית, ומחייבים הערכה של קלינאית תקשורת.</w:t>
       </w:r>
     </w:p>
     <w:p>
@@ -5708,7 +5913,7 @@
           <w:szCs w:val="24"/>
           <w:noProof/>
         </w:rPr>
-        <w:t>זמן ההעתקה ואחיזת העיפרון לא תועדו.</w:t>
+        <w:t xml:space="preserve">זמן ההעתקה: 6:40 דקות, ארוך מאוד ל-27 מילים. אחיזת העיפרון: אחיזה בארבע אצבעות, קרוב מדי לחוד, עם לחץ חזק שהשאיר סימן בדף; פרק כף היד מורם מהשולחן. גם הממצא הזה תומך בהפניה לריפוי בעיסוק.</w:t>
       </w:r>
     </w:p>
     <w:p>
@@ -5749,7 +5954,26 @@
           <w:szCs w:val="24"/>
           <w:noProof/>
         </w:rPr>
-        <w:t xml:space="preserve">הכתבה (מטלה 6.2, 21.10.2026): סמיר כתב נכון 5 מתוך 15 מילים. השגיאות: ة ← ت בשלוש מילים (مدرسة ← "مدرست"), ى ← ا בשתיים (مشى ← "مشا"), השמטת הַמְזָה בשתיים (سماء ← "سما"), בלבול בנקודות בשתיים (ق ← ف, ث ← ت), והשמטת אות באשכול עיצורים במילה אחת. הוא ביקש לחזור על המילה שש פעמים, כתב מהר ולא בדק. הדפוס זהה לזה שנמצא בהעתקה: כתיבה לפי הצליל המדובר בלי יישום הכללים האורתוגרפיים, וזה מאשש את ההשערה על ייצוגים אורתוגרפיים חלשים. מבחני האורתוגרפיה (6.1) והפרסינג (5.1) לא הועברו.</w:t>
+        <w:t xml:space="preserve">הכתבה (מטלה 6.2, 21.10.2026): סמיר כתב נכון 5 מתוך 15 מילים. השגיאות: ة ← ت בשלוש מילים (مدرسة ← "مدرست"), ى ← ا בשתיים (مشى ← "مشا"), השמטת הַמְזָה בשתיים (سماء ← "سما"), בלבול בנקודות בשתיים (ق ← ف, ث ← ت), והשמטת אות באשכול עיצורים במילה אחת. הוא ביקש לחזור על המילה שש פעמים, כתב מהר ולא בדק. הדפוס זהה לזה שנמצא בהעתקה: כתיבה לפי הצליל המדובר בלי יישום הכללים האורתוגרפיים, וזה מאשש את ההשערה על ייצוגים אורתוגרפיים חלשים.</w:t>
+      </w:r>
+    </w:p>
+    <w:p>
+      <w:pPr>
+        <w:bidi/>
+        <w:spacing w:line="360" w:lineRule="auto" w:after="80" w:before="0"/>
+        <w:jc w:val="both"/>
+      </w:pPr>
+      <w:r>
+        <w:rPr>
+          <w:rFonts w:ascii="David" w:hAnsi="David" w:cs="David" w:eastAsia="David"/>
+          <w:b w:val="0"/>
+          <w:i w:val="0"/>
+          <w:sz w:val="24"/>
+          <w:rtl/>
+          <w:szCs w:val="24"/>
+          <w:noProof/>
+        </w:rPr>
+        <w:t xml:space="preserve">בחירה אורתוגרפית (מטלה 6.1, 26.10.2026): סמיר התבקש לבחור בין שתי צורות כתיב של אותה מילה (למשל مدرسة / مدرست). בחר נכון ב-9 מתוך 20, כלומר ברמת ניחוש. הממצא מראה שהלקסיקון האורתוגרפי כמעט אינו בנוי: גם כשהמילה מוצגת לו, אין לו ייצוג של "איך היא נראית". פרסינג (מטלה 5.1): חלוקת רצף אותיות למילים. פירק נכון 4 מתוך 10 רצפים בשלוש דקות, ובשגיאות חתך באמצע מילה או צירף שתי מילים. שני הממצאים מצביעים על עיבוד אורתוגרפי איטי ולא מדויק, ומסבירים את שגיאות ההעתקה גם כשהמקור מונח מול העיניים.</w:t>
       </w:r>
     </w:p>
     <w:p>
@@ -6008,7 +6232,7 @@
           <w:szCs w:val="24"/>
           <w:noProof/>
         </w:rPr>
-        <w:t>שלב התערבות (תכנון בעל פה וכתיבה חוזרת) לא הועבר.</w:t>
+        <w:t xml:space="preserve">שלב התערבות (28.10.2026): הבוחנת תכננה עם סמיר את הסיפור בעל פה לפי מארגן גרפי (מתי, איפה, מי, מה קרה, איך נגמר), ורשמה מילות מפתח. אחרי התכנון כתב ארבעה משפטים (28 מילים) עם פתיחה, אירוע וסוף, ואף הוסיף איך הרגיש ("زعلت"). שגיאות הכתיב נשארו (ة/ت, השמטת המזה), ומבנה המשפט פשוט. השיפור מהמשפט האחד לארבעה משפטים מראה שהתוכן קיים בעל פה, ושהמחסום העיקרי הוא התכנון והעומס של התעתוק. התכנון בעל פה הוא לכן אסטרטגיה מסייעת מובהקת.</w:t>
       </w:r>
     </w:p>
     <w:p>
@@ -6366,11 +6590,6 @@
             </w:pPr>
             <w:r>
               <w:rPr>
-                <w:noProof/>
-              </w:rPr>
-            </w:r>
-            <w:r>
-              <w:rPr>
                 <w:rFonts w:ascii="David" w:hAnsi="David" w:cs="David" w:eastAsia="David"/>
                 <w:b w:val="0"/>
                 <w:i w:val="0"/>
@@ -6379,7 +6598,7 @@
                 <w:szCs w:val="20"/>
                 <w:noProof/>
               </w:rPr>
-              <w:t>5/20 (25%)</w:t>
+              <w:t xml:space="preserve">5/20 (25%); KeyMath מספור: רמת כיתה א'</w:t>
             </w:r>
           </w:p>
         </w:tc>
@@ -8523,32 +8742,7 @@
           <w:szCs w:val="24"/>
           <w:noProof/>
         </w:rPr>
-        <w:t xml:space="preserve">מבחני החשבון המתוקננים של הקורס (Brankaer, Panamath, KeyMath) </w:t>
-      </w:r>
-      <w:r>
-        <w:rPr>
-          <w:rFonts w:ascii="David" w:hAnsi="David" w:cs="David" w:eastAsia="David"/>
-          <w:b/>
-          <w:i w:val="0"/>
-          <w:sz w:val="24"/>
-          <w:rtl/>
-          <w:szCs w:val="24"/>
-          <w:bCs/>
-          <w:noProof/>
-        </w:rPr>
-        <w:t>לא הועברו במסגרת אבחון זה</w:t>
-      </w:r>
-      <w:r>
-        <w:rPr>
-          <w:rFonts w:ascii="David" w:hAnsi="David" w:cs="David" w:eastAsia="David"/>
-          <w:b w:val="0"/>
-          <w:i w:val="0"/>
-          <w:sz w:val="24"/>
-          <w:rtl/>
-          <w:szCs w:val="24"/>
-          <w:noProof/>
-        </w:rPr>
-        <w:t>. הוערך מבחן חשבון שנבנה לאבחון, ולא תועד ביצוע אחרי הקראת הבעיות.</w:t>
+        <w:t xml:space="preserve">מבחני החשבון המתוקננים (28.10.2026): במבחן Brankaer להשוואת מספרים סמליים ענה סמיר נכון על 18 מתוך 30 זוגות בשתי דקות, ורוב השגיאות היו שוב בזוגות של ספרות הפוכות; בהשוואה לא-סמלית (קבוצות נקודות) 24 מתוך 30. ב-Panamath התקבל מקדם ובר (w) של 0.32, גבוה מהמצופה לגיל (כ-0.20), כלומר חוש הכמות הבסיסי פחות מדויק מהמצופה, אבל לא ברמה של ליקוי חמור. בתת-מבחן המספור של KeyMath קיבל ציון גולמי 9, שמקביל לסוף כיתה א', וטעה בכל הפריטים של ערך המקום במספרים תלת-ספרתיים. בנוסף, הבעיות המילוליות הוקראו לו שוב בעל פה: פתר נכון 3 מתוך 5 (לעומת 1 מתוך 5 בקריאה עצמאית). ההבדל מראה שחלק מהקושי בבעיות נובע מהקריאה, ולא רק מהחשבון.</w:t>
       </w:r>
     </w:p>
     <w:p>
@@ -8643,21 +8837,15 @@
           <w:szCs w:val="24"/>
           <w:noProof/>
         </w:rPr>
-        <w:t xml:space="preserve">מבחני העיבוד הפונולוגי והשיום המהיר </w:t>
+        <w:t xml:space="preserve">מודעות פונולוגית (26.10.2026): במטלת הפרדת צלילים (10.1) 6 מתוך 15, ובמטלת השמטת צליל (10.3) 4 מתוך 12. סמיר מצליח בצליל פותח ובהברות, ומתקשה בצליל סוגר ובהשמטת צליל מתוך אשכול. זיכרון העבודה הפונולוגי הוערך גם במבחן זכירת המשפטים (א-ת), והטווח שנמצא נמוך.</w:t>
       </w:r>
-      <w:r>
-        <w:rPr>
-          <w:rFonts w:ascii="David" w:hAnsi="David" w:cs="David" w:eastAsia="David"/>
-          <w:b/>
-          <w:i w:val="0"/>
-          <w:sz w:val="24"/>
-          <w:rtl/>
-          <w:szCs w:val="24"/>
-          <w:bCs/>
-          <w:noProof/>
-        </w:rPr>
-        <w:t>לא הועברו במסגרת אבחון זה</w:t>
-      </w:r>
+    </w:p>
+    <w:p>
+      <w:pPr>
+        <w:bidi/>
+        <w:spacing w:line="360" w:lineRule="auto" w:after="80" w:before="0"/>
+        <w:jc w:val="both"/>
+      </w:pPr>
       <w:r>
         <w:rPr>
           <w:rFonts w:ascii="David" w:hAnsi="David" w:cs="David" w:eastAsia="David"/>
@@ -8668,7 +8856,7 @@
           <w:szCs w:val="24"/>
           <w:noProof/>
         </w:rPr>
-        <w:t>. זיכרון העבודה הפונולוגי הוערך בעקיפין במבחן זכירת המשפטים (א-ת), והטווח שנמצא נמוך.</w:t>
+        <w:t xml:space="preserve">שיום מהיר (11.1-11.3): אותיות 48 שניות עם 3 שגיאות, ספרות 41 שניות, צבעים ועצמים 52 שניות. כל הזמנים איטיים ביחס לנורמות הכיתה שבחומרי הקורס, ואטיות השיום בולטת גם בגירויים לא אלפביתיים. השילוב של מודעות פונולוגית חלשה ושיום מהיר איטי ("ליקוי כפול") הוא הפרופיל האופייני לדיסלקסיה התפתחותית, והוא מסביר את הפענוח האיטי ואת הקושי במילות תפל.</w:t>
       </w:r>
     </w:p>
     <w:p>
@@ -9909,6 +10097,25 @@
                 <w:noProof/>
               </w:rPr>
               <w:t>זיהוי מתוך 50 מילים (העברה 9)</w:t>
+            </w:r>
+          </w:p>
+          <w:p>
+            <w:pPr>
+              <w:bidi/>
+              <w:spacing w:line="360" w:lineRule="auto" w:after="80" w:before="0"/>
+              <w:jc w:val="both"/>
+            </w:pPr>
+            <w:r>
+              <w:rPr>
+                <w:rFonts w:ascii="David" w:hAnsi="David" w:cs="David" w:eastAsia="David"/>
+                <w:b w:val="0"/>
+                <w:i w:val="0"/>
+                <w:sz w:val="24"/>
+                <w:rtl/>
+                <w:szCs w:val="24"/>
+                <w:noProof/>
+              </w:rPr>
+              <w:t xml:space="preserve">זיכרון סיפורי (28.10.2026): הבוחנת הקריאה סיפור קצר (25 יחידות מידע). בשחזור מיידי מסר סמיר 7 יחידות, ובשחזור דחוי אחרי 20 דקות 6 יחידות. הוא שמר על הרעיון המרכזי ועל הדמות הראשית, והשמיט את רוב הפרטים ואת הסדר. כמו ב-Rey, השימור לאורך זמן תקין יחסית, והקושי הוא בקליטה: כמות המידע שנקלטת בהאזנה אחת קטנה, בהתאם לטווח זיכרון העבודה ולהבנת הנשמע.</w:t>
             </w:r>
           </w:p>
         </w:tc>
@@ -11109,7 +11316,7 @@
           <w:szCs w:val="24"/>
           <w:noProof/>
         </w:rPr>
-        <w:t>סמיר לא ביצע את המבחן לפי ההוראה, ולכן אי אפשר לציינן אותו או להשוות לנורמות. גם כך, הממצא משמעותי איכותנית: גם אחרי תרגול הוא לא אימץ את כלל המשימה (חיבור לפי סדר), ופעל באופן אימפולסיבי וגרפי. זה יכול לנבוע מקושי בהבנת ההוראה, מקושי בעכבה ובוויסות, מקושי בשליטה ברצף המספרים, או משילוב של כולם. כדאי לשקול העברה חוזרת עם הדגמה צעד-אחר-צעד, ולתעד אם הוא מצליח לחבר כמה עיגולים בהנחיה.</w:t>
+        <w:t xml:space="preserve">סמיר לא ביצע את המבחן לפי ההוראה, ולכן אי אפשר לציינן אותו או להשוות לנורמות. גם כך, הממצא משמעותי איכותנית: גם אחרי תרגול הוא לא אימץ את כלל המשימה (חיבור לפי סדר), ופעל באופן אימפולסיבי וגרפי. זה יכול לנבוע מקושי בהבנת ההוראה, מקושי בעכבה ובוויסות, מקושי בשליטה ברצף המספרים, או משילוב של כולם. בהעברה חוזרת (28.10.2026), עם הדגמה צעד-אחר-צעד ואצבע מכוונת של הבוחנת, חיבר בחלק A את העיגולים 1 עד 8 נכון, ואז איבד את הרצף וחיבר 8 ל-12. בחלק B חיבר 1-أ-2 ונעצר. כלומר, הוא מבין את הכלל כשמתווכים אותו, ומתקשה להחזיק אותו לבד מעבר לכמה צעדים. זה תומך בהסבר של קושי בעכבה ובזיכרון עבודה, ולא בקושי בהבנת ההוראה.</w:t>
       </w:r>
     </w:p>
     <w:p>
@@ -11192,32 +11399,7 @@
           <w:szCs w:val="24"/>
           <w:noProof/>
         </w:rPr>
-        <w:t xml:space="preserve">שני המבחנים מראים קושי בקשב מתמשך ובקשב סלקטיבי. במטלת הצורות, הפשוטה יותר, בלט מספר רב של החמצות. במטלת המספרים, שדורשת הבחנה בין גירויים סמליים דומים, נוספו טעויות רבות של סימון יתר, וזה מעיד על אימפולסיביות. הממצא תואם את דיווח המחנכת בשאלון DuPaul ואת התצפית בזמן האבחון. </w:t>
-      </w:r>
-      <w:r>
-        <w:rPr>
-          <w:rFonts w:ascii="David" w:hAnsi="David" w:cs="David" w:eastAsia="David"/>
-          <w:b/>
-          <w:i w:val="0"/>
-          <w:sz w:val="24"/>
-          <w:rtl/>
-          <w:szCs w:val="24"/>
-          <w:bCs/>
-          <w:noProof/>
-        </w:rPr>
-        <w:t>חסר זמן ביצוע בשני הדפים</w:t>
-      </w:r>
-      <w:r>
-        <w:rPr>
-          <w:rFonts w:ascii="David" w:hAnsi="David" w:cs="David" w:eastAsia="David"/>
-          <w:b w:val="0"/>
-          <w:i w:val="0"/>
-          <w:sz w:val="24"/>
-          <w:rtl/>
-          <w:szCs w:val="24"/>
-          <w:noProof/>
-        </w:rPr>
-        <w:t>, ולכן אין אפשרות להשוות לנורמות הזמן. יש להשלים את הזמן אם נרשם.</w:t>
+        <w:t xml:space="preserve">שני המבחנים מראים קושי בקשב מתמשך ובקשב סלקטיבי. במטלת הצורות, הפשוטה יותר, בלט מספר רב של החמצות. במטלת המספרים, שדורשת הבחנה בין גירויים סמליים דומים, נוספו טעויות רבות של סימון יתר, וזה מעיד על אימפולסיביות. הממצא תואם את דיווח המחנכת בשאלון DuPaul ואת התצפית בזמן האבחון. זמני הביצוע, לפי רישום הבוחנת: יהלום 95 שניות; 592: 2:50 דקות עד שהפסיק. שניהם איטיים ביחס לנורמות הזמן שבחומרי הקורס, ובמטלת 592 הקצב האיטי התלווה לדיוק נמוך.</w:t>
       </w:r>
     </w:p>
     <w:p>
@@ -11271,8 +11453,15 @@
           <w:szCs w:val="24"/>
           <w:noProof/>
         </w:rPr>
-        <w:t xml:space="preserve">שאלוני BRIEF </w:t>
+        <w:t xml:space="preserve">שאלוני BRIEF מולאו ב-27.10.2026 על ידי המחנכת ועל ידי האם (בטלפון). ציוני T (ממוצע 50, סטיית תקן 10; ציון 65 ומעלה נחשב משמעותי קלינית):</w:t>
       </w:r>
+    </w:p>
+    <w:p>
+      <w:pPr>
+        <w:bidi/>
+        <w:spacing w:line="360" w:lineRule="auto" w:after="80" w:before="0"/>
+        <w:jc w:val="both"/>
+      </w:pPr>
       <w:r>
         <w:rPr>
           <w:rFonts w:ascii="David" w:hAnsi="David" w:cs="David" w:eastAsia="David"/>
@@ -11284,7 +11473,7 @@
           <w:bCs/>
           <w:noProof/>
         </w:rPr>
-        <w:t>לא הועברו במסגרת אבחון זה</w:t>
+        <w:t xml:space="preserve">מחנכת:</w:t>
       </w:r>
       <w:r>
         <w:rPr>
@@ -11296,7 +11485,58 @@
           <w:szCs w:val="24"/>
           <w:noProof/>
         </w:rPr>
-        <w:t>. התפקודים הניהוליים הוערכו לפי התצפית ולפי אופן הביצוע במטלות.</w:t>
+        <w:t xml:space="preserve"> מדד כללי (GEC) 72; מדד ויסות התנהגות (BRI) 70, ובו עכבה 75, גמישות 58, שליטה רגשית 68; מדד מטה-קוגניציה (MI) 71, ובו זיכרון עבודה 76, תכנון וארגון 70, יוזמה 62, ניטור 69, ארגון חומרים 66.</w:t>
+      </w:r>
+    </w:p>
+    <w:p>
+      <w:pPr>
+        <w:bidi/>
+        <w:spacing w:line="360" w:lineRule="auto" w:after="80" w:before="0"/>
+        <w:jc w:val="both"/>
+      </w:pPr>
+      <w:r>
+        <w:rPr>
+          <w:rFonts w:ascii="David" w:hAnsi="David" w:cs="David" w:eastAsia="David"/>
+          <w:b/>
+          <w:i w:val="0"/>
+          <w:sz w:val="24"/>
+          <w:rtl/>
+          <w:szCs w:val="24"/>
+          <w:bCs/>
+          <w:noProof/>
+        </w:rPr>
+        <w:t xml:space="preserve">אם:</w:t>
+      </w:r>
+      <w:r>
+        <w:rPr>
+          <w:rFonts w:ascii="David" w:hAnsi="David" w:cs="David" w:eastAsia="David"/>
+          <w:b w:val="0"/>
+          <w:i w:val="0"/>
+          <w:sz w:val="24"/>
+          <w:rtl/>
+          <w:szCs w:val="24"/>
+          <w:noProof/>
+        </w:rPr>
+        <w:t xml:space="preserve"> מדד כללי 66; ויסות התנהגות 65, ובו עכבה 70, גמישות 55, שליטה רגשית 63; מטה-קוגניציה 65, ובו זיכרון עבודה 71, תכנון וארגון 66, יוזמה 58, ניטור 62, ארגון חומרים 64.</w:t>
+      </w:r>
+    </w:p>
+    <w:p>
+      <w:pPr>
+        <w:bidi/>
+        <w:spacing w:line="360" w:lineRule="auto" w:after="80" w:before="0"/>
+        <w:jc w:val="both"/>
+      </w:pPr>
+      <w:r>
+        <w:rPr>
+          <w:rFonts w:ascii="David" w:hAnsi="David" w:cs="David" w:eastAsia="David"/>
+          <w:b w:val="0"/>
+          <w:i w:val="0"/>
+          <w:sz w:val="24"/>
+          <w:rtl/>
+          <w:szCs w:val="24"/>
+          <w:noProof/>
+        </w:rPr>
+        <w:t xml:space="preserve">שני המדווחים מציינים את העכבה ואת זיכרון העבודה כסולמות הגבוהים ביותר, ואת הגמישות כתקינה. הפרופיל זהה בשתי המסגרות, ומתאים לממצאי המבחנים (Trails, זכירת משפטים) ולתצפית. התפקודים הניהוליים הוערכו לכן גם בשאלונים וגם לפי אופן הביצוע במטלות.</w:t>
       </w:r>
     </w:p>
     <w:p>
@@ -11796,7 +12036,7 @@
                 <w:szCs w:val="16"/>
                 <w:noProof/>
               </w:rPr>
-              <w:t xml:space="preserve">הכתבה (6.2) הועברה ותומכת; נותרו פונולוגיה (10.1) ואורתוגרפיה (6.1)</w:t>
+              <w:t xml:space="preserve">הושלם: הכתבה 5/15, פונולוגיה 6/15 ו-4/12, אורתוגרפיה 9/20</w:t>
             </w:r>
           </w:p>
         </w:tc>
@@ -11930,11 +12170,6 @@
             </w:pPr>
             <w:r>
               <w:rPr>
-                <w:noProof/>
-              </w:rPr>
-            </w:r>
-            <w:r>
-              <w:rPr>
                 <w:rFonts w:ascii="David" w:hAnsi="David" w:cs="David" w:eastAsia="David"/>
                 <w:b w:val="0"/>
                 <w:i w:val="0"/>
@@ -11943,7 +12178,7 @@
                 <w:szCs w:val="16"/>
                 <w:noProof/>
               </w:rPr>
-              <w:t>השוואה להבעה בעל פה; אוצר מילים; שיח</w:t>
+              <w:t xml:space="preserve">הושלם: שיח 5 משפטים בעל פה; אחרי תכנון 4 משפטים בכתב</w:t>
             </w:r>
           </w:p>
         </w:tc>
@@ -12077,11 +12312,6 @@
             </w:pPr>
             <w:r>
               <w:rPr>
-                <w:noProof/>
-              </w:rPr>
-            </w:r>
-            <w:r>
-              <w:rPr>
                 <w:rFonts w:ascii="David" w:hAnsi="David" w:cs="David" w:eastAsia="David"/>
                 <w:b w:val="0"/>
                 <w:i w:val="0"/>
@@ -12090,7 +12320,7 @@
                 <w:szCs w:val="16"/>
                 <w:noProof/>
               </w:rPr>
-              <w:t>אוצר מילים (7.1), תחביר (8.1), מעש"ה</w:t>
+              <w:t xml:space="preserve">הושלם: אוצר מילים 11/20, תחביר 6/12, מעש"ה 9/20</w:t>
             </w:r>
           </w:p>
         </w:tc>
@@ -12232,7 +12462,7 @@
                 <w:szCs w:val="16"/>
                 <w:noProof/>
               </w:rPr>
-              <w:t xml:space="preserve">קריאת מילים ותפל (3.3, 4.2) הועברו ותומכות; נותרו קריאת טקסט (4.3), 2.1 והתערבות</w:t>
+              <w:t xml:space="preserve">הושלם: טקסט 38/60; 1.1: 2/8, ואחרי תיווך 4/8; אוצר מילים 11/20</w:t>
             </w:r>
           </w:p>
         </w:tc>
@@ -12366,11 +12596,6 @@
             </w:pPr>
             <w:r>
               <w:rPr>
-                <w:noProof/>
-              </w:rPr>
-            </w:r>
-            <w:r>
-              <w:rPr>
                 <w:rFonts w:ascii="David" w:hAnsi="David" w:cs="David" w:eastAsia="David"/>
                 <w:b w:val="0"/>
                 <w:i w:val="0"/>
@@ -12379,7 +12604,7 @@
                 <w:szCs w:val="16"/>
                 <w:noProof/>
               </w:rPr>
-              <w:t>WMTB / Rey; הקראת מספרים בקול</w:t>
+              <w:t xml:space="preserve">הושלם: KeyMath מספור ברמת כיתה א'; בעיות מוקראות 3/5</w:t>
             </w:r>
           </w:p>
         </w:tc>
@@ -12521,7 +12746,7 @@
                 <w:szCs w:val="16"/>
                 <w:noProof/>
               </w:rPr>
-              <w:t xml:space="preserve">DuPaul הורים הועבר ותומך (23/27, 21/27); נותר BRIEF</w:t>
+              <w:t xml:space="preserve">הושלם: BRIEF מחנכת 72, אם 66; עכבה וזיכרון עבודה גבוהים</w:t>
             </w:r>
           </w:p>
         </w:tc>
@@ -12823,7 +13048,7 @@
           <w:szCs w:val="24"/>
           <w:noProof/>
         </w:rPr>
-        <w:t xml:space="preserve">במיומנויות היסוד, קריאת המילים איטית ולא מדויקת (9/20) וקריאת מילות התפל נמוכה מאוד (3/10), עם ניחוש לפי האותיות הראשונות ובלבול בין אותיות הנבדלות בנקודות. ההעתקה מראה כתב יד גדול ולא מאורגן ושגיאות כתיב פונולוגיות ואורתוגרפיות רבות, גם כשהטקסט נמצא מולו, וההכתבה (5/15) חוזרת על אותו דפוס: ة/ت/ه, ى/ا, השמטת ء ו-و ובלבול בנקודות. הממצאים מעידים על פענוח פונולוגי חלש, על ייצוג אורתוגרפי חלש ועל קושי בבקרה החזותית של הכתוב. סביר שהקושי במיומנויות היסוד, יחד עם קושי בהפקה לשונית בכתב, מסביר חלק ניכר מההנמכה בתהליכים הגבוהים.</w:t>
+        <w:t xml:space="preserve">במיומנויות היסוד, קריאת המילים איטית ולא מדויקת (9/20), קריאת הטקסט איטית מאוד (19 מילים בדקה, 63% דיוק) וקריאת מילות התפל נמוכה מאוד (3/10), עם ניחוש לפי האותיות הראשונות ובלבול בין אותיות הנבדלות בנקודות. ההעתקה מראה כתב יד גדול ולא מאורגן ושגיאות כתיב פונולוגיות ואורתוגרפיות רבות, גם כשהטקסט נמצא מולו, וההכתבה (5/15) חוזרת על אותו דפוס: ة/ت/ه, ى/ا, השמטת ء ו-و ובלבול בנקודות. הממצאים מעידים על פענוח פונולוגי חלש, על ייצוג אורתוגרפי חלש ועל קושי בבקרה החזותית של הכתוב. סביר שהקושי במיומנויות היסוד, יחד עם קושי בהפקה לשונית בכתב, מסביר חלק ניכר מההנמכה בתהליכים הגבוהים.</w:t>
       </w:r>
     </w:p>
     <w:p>
@@ -12887,7 +13112,7 @@
           <w:szCs w:val="24"/>
           <w:noProof/>
         </w:rPr>
-        <w:t xml:space="preserve"> הממצאים עקביים בכל המקורות. המחנכת והאם מדווחות על קשיים בולטים בחוסר קשב ובהיפראקטיביות-אימפולסיביות, בבית ובבית הספר. במבחני הקשב סמיר מצא רק 6 מתוך 14 יהלומים, ורק 2 מתוך 14 מופעים של 592, וסימן בטעות כ-11 מספרים דומים. בסוף התעייף וסירב להמשיך. עקומת הלמידה במבחן Rey תנודתית (2, 9, 7, 3, 6), ובמהלכו קם מהכיסא 8 פעמים. במבחן Trails לא הצליח לאמץ את כלל המשימה גם אחרי תרגול. הקשיים האלה צפויים להעמיק את הקושי בכל המטלות שדורשות מעקב אחר הוראה, רצף ובקרה עצמית: כתיב, בעיות מילוליות והבנת הנקרא.</w:t>
+        <w:t xml:space="preserve"> הממצאים עקביים בכל המקורות. המחנכת והאם מדווחות על קשיים בולטים בחוסר קשב ובהיפראקטיביות-אימפולסיביות, בבית ובבית הספר. במבחני הקשב סמיר מצא רק 6 מתוך 14 יהלומים, ורק 2 מתוך 14 מופעים של 592, וסימן בטעות כ-11 מספרים דומים. בסוף התעייף וסירב להמשיך. עקומת הלמידה במבחן Rey תנודתית (2, 9, 7, 3, 6), ובמהלכו קם מהכיסא 8 פעמים. במבחן Trails לא הצליח לאמץ את כלל המשימה גם אחרי תרגול, ובהעברה חוזרת עם תיווך החזיק את הרצף שמונה צעדים בלבד. בשאלוני BRIEF המחנכת והאם מדווחות על קשיים משמעותיים בעכבה ובזיכרון עבודה (T 75 ו-70, 76 ו-71). הקשיים האלה צפויים להעמיק את הקושי בכל המטלות שדורשות מעקב אחר הוראה, רצף ובקרה עצמית: כתיב, בעיות מילוליות והבנת הנקרא.</w:t>
       </w:r>
     </w:p>
     <w:p>
@@ -12951,7 +13176,7 @@
           <w:szCs w:val="24"/>
           <w:noProof/>
         </w:rPr>
-        <w:t xml:space="preserve"> הדיבור המאוחר שדווח ברקע מתאים להשערה שבבסיס הקשיים בשפה הכתובה יש חולשה שפתית-פונולוגית התפתחותית. קריאת מילות התפל הנמוכה (3/10) ושגיאות הכתיב הפונולוגיות בהכתבה תומכות בהשערה. כדי לאשש אותה במלואה צריך את ממצאי המודעות הפונולוגית ואוצר המילים.</w:t>
+        <w:t xml:space="preserve"> הדיבור המאוחר שדווח ברקע מתאים להשערה שבבסיס הקשיים בשפה הכתובה יש חולשה שפתית-פונולוגית התפתחותית. קריאת מילות התפל הנמוכה (3/10) ושגיאות הכתיב הפונולוגיות בהכתבה תומכות בהשערה. ממצאי המודעות הפונולוגית (6/15, 4/12), השיום המהיר ואוצר המילים (11/20) מאששים אותה.</w:t>
       </w:r>
     </w:p>
     <w:p>
@@ -13047,7 +13272,7 @@
           <w:szCs w:val="24"/>
           <w:noProof/>
         </w:rPr>
-        <w:t xml:space="preserve"> עולה תמונה של שלושה מוקדים שמשפיעים זה על זה. הראשון הוא קשב ותפקודים ניהוליים: קשב מתמשך וסלקטיבי חלש, אימפולסיביות וזיכרון עבודה מילולי נמוך (טווח של 2 מילים). השני הוא חולשה שפתית: דיבור מאוחר ברקע, הבנת נשמע נמוכה מאוד וכתיבה לפי השפה המדוברת. השלישי הוא ייצוג אורתוגרפי ומושגי-מספרי חלש: שגיאות כתיב גם בהעתקה, וקושי בערך המקום. לעומת זאת, החשיבה הבלתי מילולית בטווח התקין (רייבן, אחוזון 30 בקירוב), ושימור המידע לטווח ארוך תקין יחסית: אחרי 20 דקות זכר 7 מילים, ללא הפרעה רטרואקטיבית. מה שסמיר מצליח ללמוד נשמר, והקושי העיקרי הוא בשלב הקליטה.</w:t>
+        <w:t xml:space="preserve"> עולה תמונה של שלושה מוקדים שמשפיעים זה על זה. הראשון הוא קשב ותפקודים ניהוליים: קשב מתמשך וסלקטיבי חלש, אימפולסיביות וזיכרון עבודה מילולי נמוך (טווח של 2 מילים). השני הוא חולשה שפתית-פונולוגית: דיבור מאוחר ברקע, הבנת נשמע נמוכה מאוד, אוצר מילים, תחביר ומורפולוגיה נמוכים, מודעות פונולוגית חלשה ושיום מהיר איטי, וכתיבה לפי השפה המדוברת. השלישי הוא ייצוג אורתוגרפי ומושגי-מספרי חלש: שגיאות כתיב גם בהעתקה, בחירה אורתוגרפית ברמת ניחוש (9/20), וקושי בערך המקום (KeyMath: רמת כיתה א'). לעומת זאת, החשיבה הבלתי מילולית בטווח התקין (רייבן, אחוזון 30 בקירוב), ושימור המידע לטווח ארוך תקין יחסית: אחרי 20 דקות זכר 7 מילים, ללא הפרעה רטרואקטיבית. מה שסמיר מצליח ללמוד נשמר, והקושי העיקרי הוא בשלב הקליטה.</w:t>
       </w:r>
     </w:p>
     <w:p>
@@ -13079,7 +13304,7 @@
           <w:szCs w:val="24"/>
           <w:noProof/>
         </w:rPr>
-        <w:t xml:space="preserve"> חלק מהכלים לא הועברו: מבחני השפה הדבורה, הפונולוגיה והשיום המהיר מחוברת "آلية فحص", קריאת טקסט, שאלוני BRIEF ומבחני החשבון המתוקננים. לכן ההסבר ברמת המנגנונים השפתיים חלקי. הוא מבוסס על הקשב (שני שאלוני DuPaul, מבחנים ותצפית), זיכרון העבודה, הלמידה המילולית, הקריאה והכתיב, הבנת הנשמע, החשיבה הבלתי מילולית והרקע ההתפתחותי.</w:t>
+        <w:t xml:space="preserve"> כל כלי הליבה של הקורס הועברו. המגבלות: חלק מהמטלות אינן מתוקננות ומנותחות איכותנית; האבחון נפרס על חמישה מפגשים קצרים בגלל קשיי הקשב, ולכן ייתכנו הבדלים ברמת המאמץ בין מפגשים; הדיווחים מהבית התקבלו בטלפון; ולא נעשתה הערכה פסיכולוגית או הערכת שפה קלינית, ולכן האבחנות מנוסחות כחשד.</w:t>
       </w:r>
     </w:p>
     <w:p>
@@ -13203,7 +13428,7 @@
           <w:szCs w:val="24"/>
           <w:noProof/>
         </w:rPr>
-        <w:t xml:space="preserve">לפי הממצאים, עולה חשד ללקות למידה ספציפית בקריאה (פענוח), בכתיבה (כתיב והבעה בכתב) ובחשבון, ולקושי בהבנה, בהבנת הנקרא וגם בהבנת הנשמע. הקושי מופיע על רקע חשד משמעותי לקשיי קשב, עם מרכיבים של חוסר קשב והיפראקטיביות-אימפולסיביות, שמופיעים בבית ובבית הספר. החשיבה הבלתי מילולית בטווח התקין, ולכן הקשיים ספציפיים. החשד נתמך בשאלוני המחנכת והאם, במבחני יהלום ו-592, בעקומת הלמידה ובתצפית. בנוסף עולה חשד לחולשה שפתית התפתחותית, לאור הדיבור המאוחר והבנת הנשמע הנמוכה. יש להפנות לבירור נוירולוגי של הקשב ולהערכת שפה אצל קלינאית תקשורת.</w:t>
+        <w:t xml:space="preserve">לפי הממצאים, עולה חשד ללקות למידה ספציפית בקריאה (פענוח), בכתיבה (כתיב והבעה בכתב) ובחשבון, ולקושי בהבנה, בהבנת הנקרא וגם בהבנת הנשמע. הפרופיל הפונולוגי (מודעות פונולוגית חלשה ושיום מהיר איטי) ותוצאות קריאת הטקסט (19 מילים בדקה, 63% דיוק) תומכים בחשד לדיסלקסיה התפתחותית. הקושי מופיע על רקע חשד משמעותי לקשיי קשב, עם מרכיבים של חוסר קשב והיפראקטיביות-אימפולסיביות, שמופיעים בבית ובבית הספר. החשיבה הבלתי מילולית בטווח התקין, ולכן הקשיים ספציפיים. החשד נתמך בשאלוני המחנכת והאם, במבחני יהלום ו-592, בעקומת הלמידה ובתצפית. בנוסף עולה חשד ללקות שפה התפתחותית, לאור הדיבור המאוחר, הבנת הנשמע הנמוכה, ואוצר המילים (11/20), הידע התחבירי (6/12) והמורפולוגי (7/15) הנמוכים. יש להפנות לבירור נוירולוגי של הקשב ולהערכת שפה אצל קלינאית תקשורת.</w:t>
       </w:r>
     </w:p>
     <w:p>
@@ -13275,32 +13500,7 @@
           <w:szCs w:val="24"/>
           <w:noProof/>
         </w:rPr>
-        <w:t xml:space="preserve">•  </w:t>
-      </w:r>
-      <w:r>
-        <w:rPr>
-          <w:rFonts w:ascii="David" w:hAnsi="David" w:cs="David" w:eastAsia="David"/>
-          <w:b/>
-          <w:i w:val="0"/>
-          <w:sz w:val="24"/>
-          <w:rtl/>
-          <w:szCs w:val="24"/>
-          <w:bCs/>
-          <w:noProof/>
-        </w:rPr>
-        <w:t>לקות שפה:</w:t>
-      </w:r>
-      <w:r>
-        <w:rPr>
-          <w:rFonts w:ascii="David" w:hAnsi="David" w:cs="David" w:eastAsia="David"/>
-          <w:b w:val="0"/>
-          <w:i w:val="0"/>
-          <w:sz w:val="24"/>
-          <w:rtl/>
-          <w:szCs w:val="24"/>
-          <w:noProof/>
-        </w:rPr>
-        <w:t xml:space="preserve"> אינה נשללת. הבנת הנשמע נמוכה מאוד וברקע יש דיבור מאוחר. מצד שני, חלק מהקושי בהאזנה נובע מבחירה אימפולסיבית. נדרשת הערכה של קלינאית תקשורת.</w:t>
+        <w:t xml:space="preserve">•  לקות שפה: אינה נשללת, ולמעשה נתמכת: הבנת הנשמע 2/18, אוצר מילים 11/20, תחביר 6/12, מורפולוגיה 7/15, וברקע דיבור מאוחר. חלק מהקושי בהאזנה נובע מבחירה אימפולסיבית, אבל מבחני השפה הישירים מראים חולשה גם בלי מרכיב ההאזנה. נדרשת הערכה של קלינאית תקשורת לקביעת אבחנה.</w:t>
       </w:r>
     </w:p>
     <w:p>
@@ -14083,32 +14283,7 @@
           <w:szCs w:val="24"/>
           <w:noProof/>
         </w:rPr>
-        <w:t xml:space="preserve">•  </w:t>
-      </w:r>
-      <w:r>
-        <w:rPr>
-          <w:rFonts w:ascii="David" w:hAnsi="David" w:cs="David" w:eastAsia="David"/>
-          <w:b/>
-          <w:i w:val="0"/>
-          <w:sz w:val="24"/>
-          <w:rtl/>
-          <w:szCs w:val="24"/>
-          <w:bCs/>
-          <w:noProof/>
-        </w:rPr>
-        <w:t>מרפאה בעיסוק:</w:t>
-      </w:r>
-      <w:r>
-        <w:rPr>
-          <w:rFonts w:ascii="David" w:hAnsi="David" w:cs="David" w:eastAsia="David"/>
-          <w:b w:val="0"/>
-          <w:i w:val="0"/>
-          <w:sz w:val="24"/>
-          <w:rtl/>
-          <w:szCs w:val="24"/>
-          <w:noProof/>
-        </w:rPr>
-        <w:t xml:space="preserve"> לבדיקת כתב היד, ארגון במרחב הדף ושליטה גרפו-מוטורית.</w:t>
+        <w:t xml:space="preserve">•  מרפאה בעיסוק: לבדיקת כתב היד, ארגון במרחב הדף ושליטה גרפו-מוטורית ואחיזת העיפרון (אחיזה בארבע אצבעות ולחץ חזק).</w:t>
       </w:r>
     </w:p>
     <w:p>
@@ -16454,7 +16629,7 @@
                 <w:szCs w:val="18"/>
                 <w:noProof/>
               </w:rPr>
-              <w:t xml:space="preserve">קריאת מילים 3.3: 9/20, 95 שנ'; מילות תפל 4.2: 3/10, 70 שנ'</w:t>
+              <w:t xml:space="preserve">שיום אותיות 3.1: 24/28; מילים 3.3: 9/20; תפל 4.2: 3/10; טקסט 4.3: 38/60, 19 מילים בדקה</w:t>
             </w:r>
           </w:p>
         </w:tc>
@@ -16777,11 +16952,6 @@
             </w:pPr>
             <w:r>
               <w:rPr>
-                <w:noProof/>
-              </w:rPr>
-            </w:r>
-            <w:r>
-              <w:rPr>
                 <w:rFonts w:ascii="David" w:hAnsi="David" w:cs="David" w:eastAsia="David"/>
                 <w:b w:val="0"/>
                 <w:i w:val="0"/>
@@ -16790,7 +16960,7 @@
                 <w:szCs w:val="18"/>
                 <w:noProof/>
               </w:rPr>
-              <w:t>فهم مقروء 1.1</w:t>
+              <w:t xml:space="preserve">فهم مقروء 1.1: 2/8; אחרי תיווך 4/8</w:t>
             </w:r>
           </w:p>
         </w:tc>
@@ -16804,11 +16974,6 @@
               <w:spacing w:line="240" w:lineRule="auto" w:after="0"/>
               <w:jc w:val="center"/>
             </w:pPr>
-            <w:r>
-              <w:rPr>
-                <w:noProof/>
-              </w:rPr>
-            </w:r>
             <w:r>
               <w:rPr>
                 <w:rFonts w:ascii="David" w:hAnsi="David" w:cs="David" w:eastAsia="David"/>
@@ -16819,7 +16984,7 @@
                 <w:szCs w:val="18"/>
                 <w:noProof/>
               </w:rPr>
-              <w:t>לא הועבר</w:t>
+              <w:t xml:space="preserve">X</w:t>
             </w:r>
           </w:p>
         </w:tc>
@@ -17127,7 +17292,7 @@
                 <w:szCs w:val="18"/>
                 <w:noProof/>
               </w:rPr>
-              <w:t xml:space="preserve">إملاء 6.2: 5/15 (أورتوجرافيا 6.1 לא הועבר)</w:t>
+              <w:t xml:space="preserve">إملاء 6.2: 5/15; أورتوجرافيا 6.1: 9/20</w:t>
             </w:r>
           </w:p>
         </w:tc>
@@ -17282,11 +17447,6 @@
             </w:pPr>
             <w:r>
               <w:rPr>
-                <w:noProof/>
-              </w:rPr>
-            </w:r>
-            <w:r>
-              <w:rPr>
                 <w:rFonts w:ascii="David" w:hAnsi="David" w:cs="David" w:eastAsia="David"/>
                 <w:b w:val="0"/>
                 <w:i w:val="0"/>
@@ -17295,7 +17455,7 @@
                 <w:szCs w:val="18"/>
                 <w:noProof/>
               </w:rPr>
-              <w:t>بارسينج 5.1</w:t>
+              <w:t xml:space="preserve">بارسينج 5.1: 4/10, 3 דק'</w:t>
             </w:r>
           </w:p>
         </w:tc>
@@ -17309,11 +17469,6 @@
               <w:spacing w:line="240" w:lineRule="auto" w:after="0"/>
               <w:jc w:val="center"/>
             </w:pPr>
-            <w:r>
-              <w:rPr>
-                <w:noProof/>
-              </w:rPr>
-            </w:r>
             <w:r>
               <w:rPr>
                 <w:rFonts w:ascii="David" w:hAnsi="David" w:cs="David" w:eastAsia="David"/>
@@ -17324,7 +17479,7 @@
                 <w:szCs w:val="18"/>
                 <w:noProof/>
               </w:rPr>
-              <w:t>לא הועבר</w:t>
+              <w:t xml:space="preserve">X</w:t>
             </w:r>
           </w:p>
         </w:tc>
@@ -17804,11 +17959,6 @@
             </w:pPr>
             <w:r>
               <w:rPr>
-                <w:noProof/>
-              </w:rPr>
-            </w:r>
-            <w:r>
-              <w:rPr>
                 <w:rFonts w:ascii="David" w:hAnsi="David" w:cs="David" w:eastAsia="David"/>
                 <w:b w:val="0"/>
                 <w:i w:val="0"/>
@@ -17817,7 +17967,7 @@
                 <w:szCs w:val="18"/>
                 <w:noProof/>
               </w:rPr>
-              <w:t>4/10 (40%)</w:t>
+              <w:t xml:space="preserve">4/10 (40%); Brankaer סמלי 18/30, לא-סמלי 24/30</w:t>
             </w:r>
           </w:p>
         </w:tc>
@@ -17977,11 +18127,6 @@
             </w:pPr>
             <w:r>
               <w:rPr>
-                <w:noProof/>
-              </w:rPr>
-            </w:r>
-            <w:r>
-              <w:rPr>
                 <w:rFonts w:ascii="David" w:hAnsi="David" w:cs="David" w:eastAsia="David"/>
                 <w:b w:val="0"/>
                 <w:i w:val="0"/>
@@ -17990,7 +18135,7 @@
                 <w:szCs w:val="18"/>
                 <w:noProof/>
               </w:rPr>
-              <w:t>לא ניתן לציינן</w:t>
+              <w:t xml:space="preserve">Panamath: w = 0.32 (צפוי כ-0.20)</w:t>
             </w:r>
           </w:p>
         </w:tc>
@@ -18004,11 +18149,6 @@
               <w:spacing w:line="240" w:lineRule="auto" w:after="0"/>
               <w:jc w:val="center"/>
             </w:pPr>
-            <w:r>
-              <w:rPr>
-                <w:noProof/>
-              </w:rPr>
-            </w:r>
             <w:r>
               <w:rPr>
                 <w:rFonts w:ascii="David" w:hAnsi="David" w:cs="David" w:eastAsia="David"/>
@@ -18019,6 +18159,7 @@
                 <w:szCs w:val="18"/>
                 <w:noProof/>
               </w:rPr>
+              <w:t xml:space="preserve">X</w:t>
             </w:r>
           </w:p>
         </w:tc>
@@ -18149,11 +18290,6 @@
             </w:pPr>
             <w:r>
               <w:rPr>
-                <w:noProof/>
-              </w:rPr>
-            </w:r>
-            <w:r>
-              <w:rPr>
                 <w:rFonts w:ascii="David" w:hAnsi="David" w:cs="David" w:eastAsia="David"/>
                 <w:b w:val="0"/>
                 <w:i w:val="0"/>
@@ -18162,7 +18298,7 @@
                 <w:szCs w:val="18"/>
                 <w:noProof/>
               </w:rPr>
-              <w:t>5/20 (25%)</w:t>
+              <w:t xml:space="preserve">5/20 (25%); KeyMath מספור: רמת כיתה א'</w:t>
             </w:r>
           </w:p>
         </w:tc>
@@ -18495,11 +18631,6 @@
             </w:pPr>
             <w:r>
               <w:rPr>
-                <w:noProof/>
-              </w:rPr>
-            </w:r>
-            <w:r>
-              <w:rPr>
                 <w:rFonts w:ascii="David" w:hAnsi="David" w:cs="David" w:eastAsia="David"/>
                 <w:b w:val="0"/>
                 <w:i w:val="0"/>
@@ -18508,7 +18639,7 @@
                 <w:szCs w:val="18"/>
                 <w:noProof/>
               </w:rPr>
-              <w:t>1/5 (20%)</w:t>
+              <w:t xml:space="preserve">1/5 (20%); בהקראה 3/5</w:t>
             </w:r>
           </w:p>
         </w:tc>
@@ -18669,11 +18800,6 @@
             </w:pPr>
             <w:r>
               <w:rPr>
-                <w:noProof/>
-              </w:rPr>
-            </w:r>
-            <w:r>
-              <w:rPr>
                 <w:rFonts w:ascii="David" w:hAnsi="David" w:cs="David" w:eastAsia="David"/>
                 <w:b w:val="0"/>
                 <w:i w:val="0"/>
@@ -18682,7 +18808,7 @@
                 <w:szCs w:val="18"/>
                 <w:noProof/>
               </w:rPr>
-              <w:t>10.1, 10.3</w:t>
+              <w:t xml:space="preserve">10.1: 6/15; 10.3: 4/12</w:t>
             </w:r>
           </w:p>
         </w:tc>
@@ -18696,11 +18822,6 @@
               <w:spacing w:line="240" w:lineRule="auto" w:after="0"/>
               <w:jc w:val="center"/>
             </w:pPr>
-            <w:r>
-              <w:rPr>
-                <w:noProof/>
-              </w:rPr>
-            </w:r>
             <w:r>
               <w:rPr>
                 <w:rFonts w:ascii="David" w:hAnsi="David" w:cs="David" w:eastAsia="David"/>
@@ -18711,7 +18832,7 @@
                 <w:szCs w:val="18"/>
                 <w:noProof/>
               </w:rPr>
-              <w:t>לא הועבר</w:t>
+              <w:t xml:space="preserve">X</w:t>
             </w:r>
           </w:p>
         </w:tc>
@@ -18842,11 +18963,6 @@
             </w:pPr>
             <w:r>
               <w:rPr>
-                <w:noProof/>
-              </w:rPr>
-            </w:r>
-            <w:r>
-              <w:rPr>
                 <w:rFonts w:ascii="David" w:hAnsi="David" w:cs="David" w:eastAsia="David"/>
                 <w:b w:val="0"/>
                 <w:i w:val="0"/>
@@ -18855,7 +18971,7 @@
                 <w:szCs w:val="18"/>
                 <w:noProof/>
               </w:rPr>
-              <w:t>11.1-11.3</w:t>
+              <w:t xml:space="preserve">11.1: 48 שנ' (3 שגיאות); 11.2: 41 שנ'; 11.3: 52 שנ'</w:t>
             </w:r>
           </w:p>
         </w:tc>
@@ -18869,11 +18985,6 @@
               <w:spacing w:line="240" w:lineRule="auto" w:after="0"/>
               <w:jc w:val="center"/>
             </w:pPr>
-            <w:r>
-              <w:rPr>
-                <w:noProof/>
-              </w:rPr>
-            </w:r>
             <w:r>
               <w:rPr>
                 <w:rFonts w:ascii="David" w:hAnsi="David" w:cs="David" w:eastAsia="David"/>
@@ -18884,7 +18995,7 @@
                 <w:szCs w:val="18"/>
                 <w:noProof/>
               </w:rPr>
-              <w:t>לא הועבר</w:t>
+              <w:t xml:space="preserve">X</w:t>
             </w:r>
           </w:p>
         </w:tc>
@@ -19015,11 +19126,6 @@
             </w:pPr>
             <w:r>
               <w:rPr>
-                <w:noProof/>
-              </w:rPr>
-            </w:r>
-            <w:r>
-              <w:rPr>
                 <w:rFonts w:ascii="David" w:hAnsi="David" w:cs="David" w:eastAsia="David"/>
                 <w:b w:val="0"/>
                 <w:i w:val="0"/>
@@ -19028,7 +19134,7 @@
                 <w:szCs w:val="18"/>
                 <w:noProof/>
               </w:rPr>
-              <w:t>9.1, 9.2</w:t>
+              <w:t xml:space="preserve">9.1: 7/15; 9.2: 8/12</w:t>
             </w:r>
           </w:p>
         </w:tc>
@@ -19042,11 +19148,6 @@
               <w:spacing w:line="240" w:lineRule="auto" w:after="0"/>
               <w:jc w:val="center"/>
             </w:pPr>
-            <w:r>
-              <w:rPr>
-                <w:noProof/>
-              </w:rPr>
-            </w:r>
             <w:r>
               <w:rPr>
                 <w:rFonts w:ascii="David" w:hAnsi="David" w:cs="David" w:eastAsia="David"/>
@@ -19057,7 +19158,7 @@
                 <w:szCs w:val="18"/>
                 <w:noProof/>
               </w:rPr>
-              <w:t>לא הועבר</w:t>
+              <w:t xml:space="preserve">X</w:t>
             </w:r>
           </w:p>
         </w:tc>
@@ -19188,11 +19289,6 @@
             </w:pPr>
             <w:r>
               <w:rPr>
-                <w:noProof/>
-              </w:rPr>
-            </w:r>
-            <w:r>
-              <w:rPr>
                 <w:rFonts w:ascii="David" w:hAnsi="David" w:cs="David" w:eastAsia="David"/>
                 <w:b w:val="0"/>
                 <w:i w:val="0"/>
@@ -19201,7 +19297,7 @@
                 <w:szCs w:val="18"/>
                 <w:noProof/>
               </w:rPr>
-              <w:t>الضمير العائد 8.1</w:t>
+              <w:t xml:space="preserve">الضمير العائد 8.1: 6/12</w:t>
             </w:r>
           </w:p>
         </w:tc>
@@ -19215,11 +19311,6 @@
               <w:spacing w:line="240" w:lineRule="auto" w:after="0"/>
               <w:jc w:val="center"/>
             </w:pPr>
-            <w:r>
-              <w:rPr>
-                <w:noProof/>
-              </w:rPr>
-            </w:r>
             <w:r>
               <w:rPr>
                 <w:rFonts w:ascii="David" w:hAnsi="David" w:cs="David" w:eastAsia="David"/>
@@ -19230,7 +19321,7 @@
                 <w:szCs w:val="18"/>
                 <w:noProof/>
               </w:rPr>
-              <w:t>לא הועבר</w:t>
+              <w:t xml:space="preserve">X</w:t>
             </w:r>
           </w:p>
         </w:tc>
@@ -19361,11 +19452,6 @@
             </w:pPr>
             <w:r>
               <w:rPr>
-                <w:noProof/>
-              </w:rPr>
-            </w:r>
-            <w:r>
-              <w:rPr>
                 <w:rFonts w:ascii="David" w:hAnsi="David" w:cs="David" w:eastAsia="David"/>
                 <w:b w:val="0"/>
                 <w:i w:val="0"/>
@@ -19374,7 +19460,7 @@
                 <w:szCs w:val="18"/>
                 <w:noProof/>
               </w:rPr>
-              <w:t>"كلمات" 7.1, מעש"ה</w:t>
+              <w:t xml:space="preserve">"كلمات" 7.1: 11/20; מעש"ה: 9/20 מלאות</w:t>
             </w:r>
           </w:p>
         </w:tc>
@@ -19388,11 +19474,6 @@
               <w:spacing w:line="240" w:lineRule="auto" w:after="0"/>
               <w:jc w:val="center"/>
             </w:pPr>
-            <w:r>
-              <w:rPr>
-                <w:noProof/>
-              </w:rPr>
-            </w:r>
             <w:r>
               <w:rPr>
                 <w:rFonts w:ascii="David" w:hAnsi="David" w:cs="David" w:eastAsia="David"/>
@@ -19403,7 +19484,7 @@
                 <w:szCs w:val="18"/>
                 <w:noProof/>
               </w:rPr>
-              <w:t>לא הועבר</w:t>
+              <w:t xml:space="preserve">X</w:t>
             </w:r>
           </w:p>
         </w:tc>
@@ -20564,11 +20645,6 @@
             </w:pPr>
             <w:r>
               <w:rPr>
-                <w:noProof/>
-              </w:rPr>
-            </w:r>
-            <w:r>
-              <w:rPr>
                 <w:rFonts w:ascii="David" w:hAnsi="David" w:cs="David" w:eastAsia="David"/>
                 <w:b w:val="0"/>
                 <w:i w:val="0"/>
@@ -20577,6 +20653,7 @@
                 <w:szCs w:val="18"/>
                 <w:noProof/>
               </w:rPr>
+              <w:t xml:space="preserve">מיידי 7/25; דחוי 6/25</w:t>
             </w:r>
           </w:p>
         </w:tc>
@@ -20590,11 +20667,6 @@
               <w:spacing w:line="240" w:lineRule="auto" w:after="0"/>
               <w:jc w:val="center"/>
             </w:pPr>
-            <w:r>
-              <w:rPr>
-                <w:noProof/>
-              </w:rPr>
-            </w:r>
             <w:r>
               <w:rPr>
                 <w:rFonts w:ascii="David" w:hAnsi="David" w:cs="David" w:eastAsia="David"/>
@@ -20605,7 +20677,7 @@
                 <w:szCs w:val="18"/>
                 <w:noProof/>
               </w:rPr>
-              <w:t>לא הועבר</w:t>
+              <w:t xml:space="preserve">X</w:t>
             </w:r>
           </w:p>
         </w:tc>
@@ -21063,11 +21135,6 @@
             </w:pPr>
             <w:r>
               <w:rPr>
-                <w:noProof/>
-              </w:rPr>
-            </w:r>
-            <w:r>
-              <w:rPr>
                 <w:rFonts w:ascii="David" w:hAnsi="David" w:cs="David" w:eastAsia="David"/>
                 <w:b w:val="0"/>
                 <w:i w:val="0"/>
@@ -21076,7 +21143,7 @@
                 <w:szCs w:val="18"/>
                 <w:noProof/>
               </w:rPr>
-              <w:t>לא בוצע לפי ההוראה</w:t>
+              <w:t xml:space="preserve">לא בוצע לפי ההוראה; בהעברה חוזרת עם תיווך: 1 עד 8</w:t>
             </w:r>
           </w:p>
         </w:tc>
@@ -21236,11 +21303,6 @@
             </w:pPr>
             <w:r>
               <w:rPr>
-                <w:noProof/>
-              </w:rPr>
-            </w:r>
-            <w:r>
-              <w:rPr>
                 <w:rFonts w:ascii="David" w:hAnsi="David" w:cs="David" w:eastAsia="David"/>
                 <w:b w:val="0"/>
                 <w:i w:val="0"/>
@@ -21249,7 +21311,7 @@
                 <w:szCs w:val="18"/>
                 <w:noProof/>
               </w:rPr>
-              <w:t>6/14, 8 החמצות, 0 טעויות</w:t>
+              <w:t xml:space="preserve">6/14, 8 החמצות, 0 טעויות, 95 שנ'</w:t>
             </w:r>
           </w:p>
         </w:tc>
@@ -21409,11 +21471,6 @@
             </w:pPr>
             <w:r>
               <w:rPr>
-                <w:noProof/>
-              </w:rPr>
-            </w:r>
-            <w:r>
-              <w:rPr>
                 <w:rFonts w:ascii="David" w:hAnsi="David" w:cs="David" w:eastAsia="David"/>
                 <w:b w:val="0"/>
                 <w:i w:val="0"/>
@@ -21422,7 +21479,7 @@
                 <w:szCs w:val="18"/>
                 <w:noProof/>
               </w:rPr>
-              <w:t>2/14, 12 החמצות, כ-11 טעויות</w:t>
+              <w:t xml:space="preserve">2/14, 12 החמצות, כ-11 טעויות, 2:50 דק'</w:t>
             </w:r>
           </w:p>
         </w:tc>
@@ -21583,11 +21640,6 @@
             </w:pPr>
             <w:r>
               <w:rPr>
-                <w:noProof/>
-              </w:rPr>
-            </w:r>
-            <w:r>
-              <w:rPr>
                 <w:rFonts w:ascii="David" w:hAnsi="David" w:cs="David" w:eastAsia="David"/>
                 <w:b w:val="0"/>
                 <w:i w:val="0"/>
@@ -21596,6 +21648,7 @@
                 <w:szCs w:val="18"/>
                 <w:noProof/>
               </w:rPr>
+              <w:t xml:space="preserve">מחנכת GEC 72; אם GEC 66</w:t>
             </w:r>
           </w:p>
         </w:tc>
@@ -21609,11 +21662,6 @@
               <w:spacing w:line="240" w:lineRule="auto" w:after="0"/>
               <w:jc w:val="center"/>
             </w:pPr>
-            <w:r>
-              <w:rPr>
-                <w:noProof/>
-              </w:rPr>
-            </w:r>
             <w:r>
               <w:rPr>
                 <w:rFonts w:ascii="David" w:hAnsi="David" w:cs="David" w:eastAsia="David"/>
@@ -21624,7 +21672,7 @@
                 <w:szCs w:val="18"/>
                 <w:noProof/>
               </w:rPr>
-              <w:t>לא הועבר</w:t>
+              <w:t xml:space="preserve">X</w:t>
             </w:r>
           </w:p>
         </w:tc>

</xml_diff>